<commit_message>
Global Properties in Dialog Manager + Continued Documentation
</commit_message>
<xml_diff>
--- a/Universal Dialog Editor/UDS Documentation.docx
+++ b/Universal Dialog Editor/UDS Documentation.docx
@@ -5,7 +5,11 @@
     <w:sdt>
       <w:sdtPr>
         <w:rPr>
-          <w:lang w:val="en-US"/>
+          <w:rFonts w:eastAsiaTheme="minorHAnsi" w:cstheme="minorBidi"/>
+          <w:color w:val="auto"/>
+          <w:sz w:val="28"/>
+          <w:szCs w:val="22"/>
+          <w:lang w:val="en-US" w:eastAsia="en-US"/>
         </w:rPr>
         <w:id w:val="1478877693"/>
         <w:docPartObj>
@@ -15,13 +19,9 @@
       </w:sdtPr>
       <w:sdtEndPr>
         <w:rPr>
-          <w:rFonts w:eastAsiaTheme="minorHAnsi" w:cs="Arial"/>
+          <w:rFonts w:cs="Arial"/>
           <w:b/>
           <w:bCs/>
-          <w:color w:val="auto"/>
-          <w:sz w:val="28"/>
-          <w:szCs w:val="22"/>
-          <w:lang w:eastAsia="en-US"/>
         </w:rPr>
       </w:sdtEndPr>
       <w:sdtContent>
@@ -2127,23 +2127,21 @@
           <w:lang w:val="en-US"/>
         </w:rPr>
       </w:pPr>
-      <w:proofErr w:type="gramStart"/>
       <w:r>
         <w:rPr>
           <w:i/>
           <w:iCs/>
           <w:lang w:val="en-US"/>
         </w:rPr>
-        <w:t>First of all</w:t>
-      </w:r>
-      <w:proofErr w:type="gramEnd"/>
+        <w:t>First of all, thank you for buying and using the Universal Dialog System for Unity</w:t>
+      </w:r>
       <w:r>
         <w:rPr>
           <w:i/>
           <w:iCs/>
           <w:lang w:val="en-US"/>
         </w:rPr>
-        <w:t>, thank you for buying and using the Universal Dialog System for Unity</w:t>
+        <w:t xml:space="preserve"> by Benedikt Wille</w:t>
       </w:r>
       <w:r>
         <w:rPr>
@@ -2151,14 +2149,6 @@
           <w:iCs/>
           <w:lang w:val="en-US"/>
         </w:rPr>
-        <w:t xml:space="preserve"> by Benedikt Wille</w:t>
-      </w:r>
-      <w:r>
-        <w:rPr>
-          <w:i/>
-          <w:iCs/>
-          <w:lang w:val="en-US"/>
-        </w:rPr>
         <w:t xml:space="preserve">. </w:t>
       </w:r>
     </w:p>
@@ -2263,21 +2253,13 @@
         <w:rPr>
           <w:lang w:val="en-US"/>
         </w:rPr>
-        <w:t xml:space="preserve">. To play them </w:t>
-      </w:r>
-      <w:proofErr w:type="spellStart"/>
-      <w:r>
-        <w:rPr>
-          <w:lang w:val="en-US"/>
-        </w:rPr>
-        <w:t>ingame</w:t>
-      </w:r>
-      <w:proofErr w:type="spellEnd"/>
-      <w:r>
-        <w:rPr>
-          <w:lang w:val="en-US"/>
-        </w:rPr>
-        <w:t xml:space="preserve"> you use the</w:t>
+        <w:t>. To play them ingame you use the</w:t>
+      </w:r>
+      <w:r>
+        <w:rPr>
+          <w:lang w:val="en-US"/>
+        </w:rPr>
+        <w:t xml:space="preserve"> UDSDialogManager</w:t>
       </w:r>
       <w:r>
         <w:rPr>
@@ -2285,14 +2267,24 @@
         </w:rPr>
         <w:t xml:space="preserve"> </w:t>
       </w:r>
-      <w:proofErr w:type="spellStart"/>
-      <w:r>
-        <w:rPr>
-          <w:lang w:val="en-US"/>
-        </w:rPr>
-        <w:t>UDSDialogManager</w:t>
-      </w:r>
-      <w:proofErr w:type="spellEnd"/>
+      <w:r>
+        <w:rPr>
+          <w:lang w:val="en-US"/>
+        </w:rPr>
+        <w:t>c</w:t>
+      </w:r>
+      <w:r>
+        <w:rPr>
+          <w:lang w:val="en-US"/>
+        </w:rPr>
+        <w:t>omponent</w:t>
+      </w:r>
+      <w:r>
+        <w:rPr>
+          <w:lang w:val="en-US"/>
+        </w:rPr>
+        <w:t>.</w:t>
+      </w:r>
       <w:r>
         <w:rPr>
           <w:lang w:val="en-US"/>
@@ -2303,51 +2295,13 @@
         <w:rPr>
           <w:lang w:val="en-US"/>
         </w:rPr>
-        <w:t>c</w:t>
-      </w:r>
-      <w:r>
-        <w:rPr>
-          <w:lang w:val="en-US"/>
-        </w:rPr>
-        <w:t>omponent</w:t>
-      </w:r>
-      <w:r>
-        <w:rPr>
-          <w:lang w:val="en-US"/>
-        </w:rPr>
-        <w:t>.</w:t>
-      </w:r>
-      <w:r>
-        <w:rPr>
-          <w:lang w:val="en-US"/>
-        </w:rPr>
-        <w:t xml:space="preserve"> </w:t>
-      </w:r>
-      <w:r>
-        <w:rPr>
-          <w:lang w:val="en-US"/>
-        </w:rPr>
         <w:t>It takes</w:t>
       </w:r>
       <w:r>
         <w:rPr>
           <w:lang w:val="en-US"/>
         </w:rPr>
-        <w:t xml:space="preserve"> care of showing text, answers, etc. in the UI. This includes loading the Dialogs from the Resources folder, playing back text gradually, responding to user input (</w:t>
-      </w:r>
-      <w:proofErr w:type="gramStart"/>
-      <w:r>
-        <w:rPr>
-          <w:lang w:val="en-US"/>
-        </w:rPr>
-        <w:t>e.g.</w:t>
-      </w:r>
-      <w:proofErr w:type="gramEnd"/>
-      <w:r>
-        <w:rPr>
-          <w:lang w:val="en-US"/>
-        </w:rPr>
-        <w:t xml:space="preserve"> answers) on both desktop and touch devices </w:t>
+        <w:t xml:space="preserve"> care of showing text, answers, etc. in the UI. This includes loading the Dialogs from the Resources folder, playing back text gradually, responding to user input (e.g. answers) on both desktop and touch devices </w:t>
       </w:r>
       <w:r>
         <w:rPr>
@@ -2371,35 +2325,7 @@
         <w:rPr>
           <w:lang w:val="en-US"/>
         </w:rPr>
-        <w:t xml:space="preserve">Unity’s </w:t>
-      </w:r>
-      <w:proofErr w:type="spellStart"/>
-      <w:r>
-        <w:rPr>
-          <w:lang w:val="en-US"/>
-        </w:rPr>
-        <w:t>MonoBehaviours</w:t>
-      </w:r>
-      <w:proofErr w:type="spellEnd"/>
-      <w:r>
-        <w:rPr>
-          <w:lang w:val="en-US"/>
-        </w:rPr>
-        <w:t xml:space="preserve"> and messages (Start, </w:t>
-      </w:r>
-      <w:proofErr w:type="spellStart"/>
-      <w:r>
-        <w:rPr>
-          <w:lang w:val="en-US"/>
-        </w:rPr>
-        <w:t>OnTriggerEnter</w:t>
-      </w:r>
-      <w:proofErr w:type="spellEnd"/>
-      <w:r>
-        <w:rPr>
-          <w:lang w:val="en-US"/>
-        </w:rPr>
-        <w:t>, …) work.</w:t>
+        <w:t>Unity’s MonoBehaviours and messages (Start, OnTriggerEnter, …) work.</w:t>
       </w:r>
     </w:p>
     <w:p>
@@ -2423,7 +2349,7 @@
           <w:bCs/>
           <w:lang w:val="en-US"/>
         </w:rPr>
-        <w:t xml:space="preserve">If you are reading these docs for the first time and just want to get some Dialogs up and running for your game, I recommend starting with </w:t>
+        <w:t>If you are reading these docs for the first time and just want to get some Dialogs up and running for your game, I recommend</w:t>
       </w:r>
       <w:r>
         <w:rPr>
@@ -2431,32 +2357,40 @@
           <w:bCs/>
           <w:lang w:val="en-US"/>
         </w:rPr>
-        <w:t>(surprise!)</w:t>
-      </w:r>
-    </w:p>
-    <w:p>
-      <w:pPr>
+        <w:t xml:space="preserve"> glancing over 1.1 and 1.2 and then</w:t>
+      </w:r>
+      <w:r>
         <w:rPr>
           <w:b/>
           <w:bCs/>
           <w:lang w:val="en-US"/>
         </w:rPr>
-      </w:pPr>
+        <w:t xml:space="preserve"> starting with </w:t>
+      </w:r>
       <w:r>
         <w:rPr>
           <w:b/>
           <w:bCs/>
           <w:lang w:val="en-US"/>
         </w:rPr>
-        <w:t xml:space="preserve">3. </w:t>
-      </w:r>
-      <w:r>
+        <w:t>(surprise!)</w:t>
+      </w:r>
+    </w:p>
+    <w:p>
+      <w:pPr>
         <w:rPr>
           <w:b/>
           <w:bCs/>
           <w:lang w:val="en-US"/>
         </w:rPr>
-        <w:t>Quick start – Setup and making a Dialog</w:t>
+      </w:pPr>
+      <w:r>
+        <w:rPr>
+          <w:b/>
+          <w:bCs/>
+          <w:lang w:val="en-US"/>
+        </w:rPr>
+        <w:t>3. Quick start – Setup and making a Dialog</w:t>
       </w:r>
     </w:p>
     <w:p>
@@ -2607,14 +2541,25 @@
         <w:rPr>
           <w:lang w:val="en-US"/>
         </w:rPr>
-        <w:t xml:space="preserve">The Dialogs are being stored as JSON files with the </w:t>
-      </w:r>
-      <w:proofErr w:type="gramStart"/>
-      <w:r>
-        <w:rPr>
-          <w:lang w:val="en-US"/>
-        </w:rPr>
-        <w:t>“</w:t>
+        <w:t>The Dialogs are being stored as JSON files with the “</w:t>
+      </w:r>
+      <w:r>
+        <w:rPr>
+          <w:lang w:val="en-US"/>
+        </w:rPr>
+        <w:t>.udsdialog.json</w:t>
+      </w:r>
+      <w:r>
+        <w:rPr>
+          <w:lang w:val="en-US"/>
+        </w:rPr>
+        <w:t>” extension. They are being loaded into your project via Unity’s Resources folder.</w:t>
+      </w:r>
+      <w:r>
+        <w:rPr>
+          <w:lang w:val="en-US"/>
+        </w:rPr>
+        <w:t xml:space="preserve"> To load the JSON files, JSON .NET for Unity is being used (see How to Install)</w:t>
       </w:r>
       <w:r>
         <w:rPr>
@@ -2622,27 +2567,6 @@
         </w:rPr>
         <w:t>.</w:t>
       </w:r>
-      <w:proofErr w:type="spellStart"/>
-      <w:r>
-        <w:rPr>
-          <w:lang w:val="en-US"/>
-        </w:rPr>
-        <w:t>udsdialog</w:t>
-      </w:r>
-      <w:proofErr w:type="gramEnd"/>
-      <w:r>
-        <w:rPr>
-          <w:lang w:val="en-US"/>
-        </w:rPr>
-        <w:t>.json</w:t>
-      </w:r>
-      <w:proofErr w:type="spellEnd"/>
-      <w:r>
-        <w:rPr>
-          <w:lang w:val="en-US"/>
-        </w:rPr>
-        <w:t>” extension. They are being loaded into your project via Unity’s Resources folder.</w:t>
-      </w:r>
     </w:p>
     <w:p>
       <w:pPr>
@@ -2675,35 +2599,7 @@
         <w:rPr>
           <w:lang w:val="en-US"/>
         </w:rPr>
-        <w:t xml:space="preserve"> </w:t>
-      </w:r>
-      <w:proofErr w:type="spellStart"/>
-      <w:r>
-        <w:rPr>
-          <w:lang w:val="en-US"/>
-        </w:rPr>
-        <w:t>ingame</w:t>
-      </w:r>
-      <w:proofErr w:type="spellEnd"/>
-      <w:r>
-        <w:rPr>
-          <w:lang w:val="en-US"/>
-        </w:rPr>
-        <w:t xml:space="preserve"> you use the </w:t>
-      </w:r>
-      <w:proofErr w:type="spellStart"/>
-      <w:r>
-        <w:rPr>
-          <w:lang w:val="en-US"/>
-        </w:rPr>
-        <w:t>UDSDialogManager</w:t>
-      </w:r>
-      <w:proofErr w:type="spellEnd"/>
-      <w:r>
-        <w:rPr>
-          <w:lang w:val="en-US"/>
-        </w:rPr>
-        <w:t xml:space="preserve"> component. </w:t>
+        <w:t xml:space="preserve"> ingame you use the UDSDialogManager component. </w:t>
       </w:r>
       <w:r>
         <w:rPr>
@@ -2727,21 +2623,7 @@
         <w:rPr>
           <w:lang w:val="en-US"/>
         </w:rPr>
-        <w:t>playing back text gradually, responding to user input (</w:t>
-      </w:r>
-      <w:proofErr w:type="gramStart"/>
-      <w:r>
-        <w:rPr>
-          <w:lang w:val="en-US"/>
-        </w:rPr>
-        <w:t>e.g.</w:t>
-      </w:r>
-      <w:proofErr w:type="gramEnd"/>
-      <w:r>
-        <w:rPr>
-          <w:lang w:val="en-US"/>
-        </w:rPr>
-        <w:t xml:space="preserve"> answers) on both desktop and touch devices and providing loads of interfaces for your code to work with.</w:t>
+        <w:t>playing back text gradually, responding to user input (e.g. answers) on both desktop and touch devices and providing loads of interfaces for your code to work with.</w:t>
       </w:r>
     </w:p>
     <w:p>
@@ -2799,69 +2681,23 @@
           <w:bCs/>
           <w:lang w:val="en-US"/>
         </w:rPr>
-        <w:t xml:space="preserve"> with your own code by overriding methods </w:t>
-      </w:r>
-      <w:proofErr w:type="gramStart"/>
+        <w:t xml:space="preserve"> with your own code by overriding methods similar to how Unity’s </w:t>
+      </w:r>
       <w:r>
         <w:rPr>
           <w:b/>
           <w:bCs/>
           <w:lang w:val="en-US"/>
         </w:rPr>
-        <w:t>similar to</w:t>
-      </w:r>
-      <w:proofErr w:type="gramEnd"/>
+        <w:t xml:space="preserve">MonoBehaviours and </w:t>
+      </w:r>
       <w:r>
         <w:rPr>
           <w:b/>
           <w:bCs/>
           <w:lang w:val="en-US"/>
         </w:rPr>
-        <w:t xml:space="preserve"> how Unity’s </w:t>
-      </w:r>
-      <w:proofErr w:type="spellStart"/>
-      <w:r>
-        <w:rPr>
-          <w:b/>
-          <w:bCs/>
-          <w:lang w:val="en-US"/>
-        </w:rPr>
-        <w:t>MonoBehaviours</w:t>
-      </w:r>
-      <w:proofErr w:type="spellEnd"/>
-      <w:r>
-        <w:rPr>
-          <w:b/>
-          <w:bCs/>
-          <w:lang w:val="en-US"/>
-        </w:rPr>
-        <w:t xml:space="preserve"> and </w:t>
-      </w:r>
-      <w:r>
-        <w:rPr>
-          <w:b/>
-          <w:bCs/>
-          <w:lang w:val="en-US"/>
-        </w:rPr>
-        <w:t xml:space="preserve">messages (Start, </w:t>
-      </w:r>
-      <w:proofErr w:type="spellStart"/>
-      <w:r>
-        <w:rPr>
-          <w:b/>
-          <w:bCs/>
-          <w:lang w:val="en-US"/>
-        </w:rPr>
-        <w:t>OnTriggerEnter</w:t>
-      </w:r>
-      <w:proofErr w:type="spellEnd"/>
-      <w:r>
-        <w:rPr>
-          <w:b/>
-          <w:bCs/>
-          <w:lang w:val="en-US"/>
-        </w:rPr>
-        <w:t>, …) work</w:t>
+        <w:t>messages (Start, OnTriggerEnter, …) work</w:t>
       </w:r>
       <w:r>
         <w:rPr>
@@ -2901,9 +2737,8 @@
           <w:szCs w:val="20"/>
           <w:lang w:val="en-US"/>
         </w:rPr>
-        <w:t xml:space="preserve">Note: You </w:t>
-      </w:r>
-      <w:proofErr w:type="gramStart"/>
+        <w:t xml:space="preserve">Note: You don’t </w:t>
+      </w:r>
       <w:r>
         <w:rPr>
           <w:i/>
@@ -2912,9 +2747,8 @@
           <w:szCs w:val="20"/>
           <w:lang w:val="en-US"/>
         </w:rPr>
-        <w:t>don’t</w:t>
-      </w:r>
-      <w:proofErr w:type="gramEnd"/>
+        <w:t>NEED</w:t>
+      </w:r>
       <w:r>
         <w:rPr>
           <w:i/>
@@ -2923,7 +2757,7 @@
           <w:szCs w:val="20"/>
           <w:lang w:val="en-US"/>
         </w:rPr>
-        <w:t xml:space="preserve"> </w:t>
+        <w:t xml:space="preserve"> to </w:t>
       </w:r>
       <w:r>
         <w:rPr>
@@ -2933,7 +2767,7 @@
           <w:szCs w:val="20"/>
           <w:lang w:val="en-US"/>
         </w:rPr>
-        <w:t>NEED</w:t>
+        <w:t>do any programming</w:t>
       </w:r>
       <w:r>
         <w:rPr>
@@ -2943,7 +2777,7 @@
           <w:szCs w:val="20"/>
           <w:lang w:val="en-US"/>
         </w:rPr>
-        <w:t xml:space="preserve"> to </w:t>
+        <w:t>. The Dialog System works fine with</w:t>
       </w:r>
       <w:r>
         <w:rPr>
@@ -2953,7 +2787,7 @@
           <w:szCs w:val="20"/>
           <w:lang w:val="en-US"/>
         </w:rPr>
-        <w:t>do any programmin</w:t>
+        <w:t>out custom functionality</w:t>
       </w:r>
       <w:r>
         <w:rPr>
@@ -2963,7 +2797,7 @@
           <w:szCs w:val="20"/>
           <w:lang w:val="en-US"/>
         </w:rPr>
-        <w:t>g</w:t>
+        <w:t xml:space="preserve">. However, </w:t>
       </w:r>
       <w:r>
         <w:rPr>
@@ -2973,7 +2807,7 @@
           <w:szCs w:val="20"/>
           <w:lang w:val="en-US"/>
         </w:rPr>
-        <w:t>. The Dialog System works fine with</w:t>
+        <w:t xml:space="preserve">you can </w:t>
       </w:r>
       <w:r>
         <w:rPr>
@@ -2983,7 +2817,7 @@
           <w:szCs w:val="20"/>
           <w:lang w:val="en-US"/>
         </w:rPr>
-        <w:t>out custom functionality</w:t>
+        <w:t xml:space="preserve">easily </w:t>
       </w:r>
       <w:r>
         <w:rPr>
@@ -2993,7 +2827,7 @@
           <w:szCs w:val="20"/>
           <w:lang w:val="en-US"/>
         </w:rPr>
-        <w:t xml:space="preserve">. However, </w:t>
+        <w:t>do so</w:t>
       </w:r>
       <w:r>
         <w:rPr>
@@ -3003,7 +2837,7 @@
           <w:szCs w:val="20"/>
           <w:lang w:val="en-US"/>
         </w:rPr>
-        <w:t xml:space="preserve">you can </w:t>
+        <w:t xml:space="preserve"> to add your own logic to </w:t>
       </w:r>
       <w:r>
         <w:rPr>
@@ -3013,7 +2847,7 @@
           <w:szCs w:val="20"/>
           <w:lang w:val="en-US"/>
         </w:rPr>
-        <w:t xml:space="preserve">easily </w:t>
+        <w:t xml:space="preserve">the </w:t>
       </w:r>
       <w:r>
         <w:rPr>
@@ -3023,40 +2857,8 @@
           <w:szCs w:val="20"/>
           <w:lang w:val="en-US"/>
         </w:rPr>
-        <w:t>do so</w:t>
-      </w:r>
-      <w:r>
-        <w:rPr>
-          <w:i/>
-          <w:iCs/>
-          <w:sz w:val="24"/>
-          <w:szCs w:val="20"/>
-          <w:lang w:val="en-US"/>
-        </w:rPr>
-        <w:t xml:space="preserve"> to add your own logic to </w:t>
-      </w:r>
-      <w:r>
-        <w:rPr>
-          <w:i/>
-          <w:iCs/>
-          <w:sz w:val="24"/>
-          <w:szCs w:val="20"/>
-          <w:lang w:val="en-US"/>
-        </w:rPr>
-        <w:t xml:space="preserve">the </w:t>
-      </w:r>
-      <w:proofErr w:type="gramStart"/>
-      <w:r>
-        <w:rPr>
-          <w:i/>
-          <w:iCs/>
-          <w:sz w:val="24"/>
-          <w:szCs w:val="20"/>
-          <w:lang w:val="en-US"/>
-        </w:rPr>
-        <w:t>Dialogs</w:t>
-      </w:r>
-      <w:proofErr w:type="gramEnd"/>
+        <w:t>Dialogs.</w:t>
+      </w:r>
     </w:p>
     <w:p>
       <w:pPr>
@@ -3092,6 +2894,7 @@
         <w:rPr>
           <w:lang w:val="en-US"/>
         </w:rPr>
+        <w:lastRenderedPageBreak/>
         <w:t>How a Dialog graph is structured</w:t>
       </w:r>
       <w:bookmarkEnd w:id="4"/>
@@ -3106,28 +2909,7 @@
         <w:rPr>
           <w:lang w:val="en-US"/>
         </w:rPr>
-        <w:t xml:space="preserve">Every Dialog consists of Dialog Parts. A Dialog Part is one node in the Dialog graph. </w:t>
-      </w:r>
-      <w:proofErr w:type="gramStart"/>
-      <w:r>
-        <w:rPr>
-          <w:lang w:val="en-US"/>
-        </w:rPr>
-        <w:t>It’s</w:t>
-      </w:r>
-      <w:proofErr w:type="gramEnd"/>
-      <w:r>
-        <w:rPr>
-          <w:lang w:val="en-US"/>
-        </w:rPr>
-        <w:t xml:space="preserve"> most important feature is its text, which is just the text </w:t>
-      </w:r>
-      <w:r>
-        <w:rPr>
-          <w:lang w:val="en-US"/>
-        </w:rPr>
-        <w:lastRenderedPageBreak/>
-        <w:t xml:space="preserve">said by the Dialog partner at that node </w:t>
+        <w:t xml:space="preserve">Every Dialog consists of Dialog Parts. A Dialog Part is one node in the Dialog graph. It’s most important feature is its text, which is just the text said by the Dialog partner at that node </w:t>
       </w:r>
       <w:r>
         <w:rPr>
@@ -3153,49 +2935,13 @@
           <w:szCs w:val="20"/>
           <w:lang w:val="en-US"/>
         </w:rPr>
-        <w:t>(</w:t>
-      </w:r>
-      <w:proofErr w:type="gramStart"/>
-      <w:r>
-        <w:rPr>
-          <w:i/>
-          <w:iCs/>
-          <w:sz w:val="24"/>
-          <w:szCs w:val="20"/>
-          <w:lang w:val="en-US"/>
-        </w:rPr>
-        <w:t>e.g.</w:t>
-      </w:r>
-      <w:proofErr w:type="gramEnd"/>
-      <w:r>
-        <w:rPr>
-          <w:i/>
-          <w:iCs/>
-          <w:sz w:val="24"/>
-          <w:szCs w:val="20"/>
-          <w:lang w:val="en-US"/>
-        </w:rPr>
-        <w:t xml:space="preserve"> “Yes”, “No”, “Goodbye”, …)</w:t>
-      </w:r>
-      <w:r>
-        <w:rPr>
-          <w:lang w:val="en-US"/>
-        </w:rPr>
-        <w:t xml:space="preserve">. The Answers serve as the edges of the Dialog graph by connecting the Dialog Parts. However, Dialog Parts can also be </w:t>
-      </w:r>
-      <w:proofErr w:type="gramStart"/>
-      <w:r>
-        <w:rPr>
-          <w:lang w:val="en-US"/>
-        </w:rPr>
-        <w:t>connected together</w:t>
-      </w:r>
-      <w:proofErr w:type="gramEnd"/>
-      <w:r>
-        <w:rPr>
-          <w:lang w:val="en-US"/>
-        </w:rPr>
-        <w:t xml:space="preserve"> directly, if the Part with the outgoing edge does not have any answers. Dialogs, Dialog Parts and Answers are all called Dialog Components.</w:t>
+        <w:t>(e.g. “Yes”, “No”, “Goodbye”, …)</w:t>
+      </w:r>
+      <w:r>
+        <w:rPr>
+          <w:lang w:val="en-US"/>
+        </w:rPr>
+        <w:t>. The Answers serve as the edges of the Dialog graph by connecting the Dialog Parts. However, Dialog Parts can also be connected together directly, if the Part with the outgoing edge does not have any answers. Dialogs, Dialog Parts and Answers are all called Dialog Components.</w:t>
       </w:r>
     </w:p>
     <w:p>
@@ -3236,9 +2982,8 @@
           <w:szCs w:val="20"/>
           <w:lang w:val="en-US"/>
         </w:rPr>
-        <w:t xml:space="preserve">Note: You </w:t>
-      </w:r>
-      <w:proofErr w:type="gramStart"/>
+        <w:t>Note: You don’t need to use Properties in your game. The Dialog System works fine with just the required ones. However, they are your way to add your own logic to a Dialog</w:t>
+      </w:r>
       <w:r>
         <w:rPr>
           <w:i/>
@@ -3247,56 +2992,93 @@
           <w:szCs w:val="20"/>
           <w:lang w:val="en-US"/>
         </w:rPr>
-        <w:t>don’t</w:t>
-      </w:r>
-      <w:proofErr w:type="gramEnd"/>
+        <w:t>.</w:t>
+      </w:r>
+    </w:p>
+    <w:p>
+      <w:pPr>
+        <w:rPr>
+          <w:lang w:val="en-US"/>
+        </w:rPr>
+      </w:pPr>
+      <w:r>
+        <w:rPr>
+          <w:lang w:val="en-US"/>
+        </w:rPr>
+        <w:t xml:space="preserve">Properties are like variables in C# and can be of type </w:t>
+      </w:r>
       <w:r>
         <w:rPr>
           <w:i/>
           <w:iCs/>
-          <w:sz w:val="24"/>
-          <w:szCs w:val="20"/>
-          <w:lang w:val="en-US"/>
-        </w:rPr>
-        <w:t xml:space="preserve"> need to use Properties in your game. The Dialog System works fine with just the required ones. However, they are your way to add your own logic to a </w:t>
-      </w:r>
-      <w:proofErr w:type="gramStart"/>
+          <w:lang w:val="en-US"/>
+        </w:rPr>
+        <w:t xml:space="preserve">string, int, bool </w:t>
+      </w:r>
+      <w:r>
+        <w:rPr>
+          <w:lang w:val="en-US"/>
+        </w:rPr>
+        <w:t xml:space="preserve">or </w:t>
+      </w:r>
       <w:r>
         <w:rPr>
           <w:i/>
           <w:iCs/>
-          <w:sz w:val="24"/>
-          <w:szCs w:val="20"/>
-          <w:lang w:val="en-US"/>
-        </w:rPr>
-        <w:t>Dialog</w:t>
-      </w:r>
-      <w:proofErr w:type="gramEnd"/>
-    </w:p>
-    <w:p>
-      <w:pPr>
-        <w:rPr>
-          <w:lang w:val="en-US"/>
-        </w:rPr>
-      </w:pPr>
-      <w:r>
-        <w:rPr>
-          <w:lang w:val="en-US"/>
-        </w:rPr>
-        <w:t xml:space="preserve">Properties are like variables in C# and can be of type string, int, bool or float. Every Dialog Component can have as many Properties as you like. However, a few Properties (like the “Text”) are required and enforced by the editor. </w:t>
-      </w:r>
-    </w:p>
-    <w:p>
-      <w:pPr>
-        <w:rPr>
-          <w:lang w:val="en-US"/>
-        </w:rPr>
-      </w:pPr>
-      <w:r>
-        <w:rPr>
-          <w:lang w:val="en-US"/>
-        </w:rPr>
-        <w:t xml:space="preserve">An example of a useful Property for an Answer would be “Opens </w:t>
+          <w:lang w:val="en-US"/>
+        </w:rPr>
+        <w:t>float</w:t>
+      </w:r>
+      <w:r>
+        <w:rPr>
+          <w:lang w:val="en-US"/>
+        </w:rPr>
+        <w:t xml:space="preserve">. Every Dialog Component can have as many Properties as you like. However, a few Properties (like the “Text”) are required and enforced by the editor. </w:t>
+      </w:r>
+    </w:p>
+    <w:p>
+      <w:pPr>
+        <w:rPr>
+          <w:lang w:val="en-US"/>
+        </w:rPr>
+      </w:pPr>
+      <w:r>
+        <w:rPr>
+          <w:b/>
+          <w:bCs/>
+          <w:lang w:val="en-US"/>
+        </w:rPr>
+        <w:t>An example</w:t>
+      </w:r>
+      <w:r>
+        <w:rPr>
+          <w:lang w:val="en-US"/>
+        </w:rPr>
+        <w:t xml:space="preserve"> </w:t>
+      </w:r>
+      <w:r>
+        <w:rPr>
+          <w:lang w:val="en-US"/>
+        </w:rPr>
+        <w:t>of</w:t>
+      </w:r>
+      <w:r>
+        <w:rPr>
+          <w:lang w:val="en-US"/>
+        </w:rPr>
+        <w:t xml:space="preserve"> a</w:t>
+      </w:r>
+      <w:r>
+        <w:rPr>
+          <w:lang w:val="en-US"/>
+        </w:rPr>
+        <w:t>n</w:t>
+      </w:r>
+      <w:r>
+        <w:rPr>
+          <w:lang w:val="en-US"/>
+        </w:rPr>
+        <w:t xml:space="preserve"> useful Property for an Answer would be “Opens </w:t>
       </w:r>
       <w:r>
         <w:rPr>
@@ -3308,34 +3090,48 @@
         <w:rPr>
           <w:lang w:val="en-US"/>
         </w:rPr>
-        <w:t xml:space="preserve">hop” of type bool, which signals to your </w:t>
-      </w:r>
-      <w:r>
-        <w:rPr>
-          <w:lang w:val="en-US"/>
-        </w:rPr>
-        <w:t xml:space="preserve">game </w:t>
-      </w:r>
-      <w:r>
-        <w:rPr>
-          <w:lang w:val="en-US"/>
-        </w:rPr>
-        <w:t xml:space="preserve">code </w:t>
-      </w:r>
-      <w:r>
-        <w:rPr>
-          <w:lang w:val="en-US"/>
-        </w:rPr>
-        <w:t>whether a shop should be opened when this Answer is being chosen. A fitting text would be “I want to buy something”.</w:t>
-      </w:r>
-    </w:p>
-    <w:p>
-      <w:pPr>
+        <w:t xml:space="preserve">hop” of type </w:t>
+      </w:r>
+      <w:r>
         <w:rPr>
           <w:i/>
           <w:iCs/>
           <w:lang w:val="en-US"/>
         </w:rPr>
+        <w:t>bool</w:t>
+      </w:r>
+      <w:r>
+        <w:rPr>
+          <w:lang w:val="en-US"/>
+        </w:rPr>
+        <w:t xml:space="preserve">, which signals to your </w:t>
+      </w:r>
+      <w:r>
+        <w:rPr>
+          <w:lang w:val="en-US"/>
+        </w:rPr>
+        <w:t xml:space="preserve">game </w:t>
+      </w:r>
+      <w:r>
+        <w:rPr>
+          <w:lang w:val="en-US"/>
+        </w:rPr>
+        <w:t xml:space="preserve">code </w:t>
+      </w:r>
+      <w:r>
+        <w:rPr>
+          <w:lang w:val="en-US"/>
+        </w:rPr>
+        <w:t>whether a shop should be opened when this Answer is being chosen. A fitting text would be “I want to buy something”.</w:t>
+      </w:r>
+    </w:p>
+    <w:p>
+      <w:pPr>
+        <w:rPr>
+          <w:i/>
+          <w:iCs/>
+          <w:lang w:val="en-US"/>
+        </w:rPr>
       </w:pPr>
       <w:r>
         <w:rPr>
@@ -3347,21 +3143,13 @@
         <w:rPr>
           <w:lang w:val="en-US"/>
         </w:rPr>
-        <w:t xml:space="preserve">Properties using the Dialog Editor and then access them in your game code inside a method overridden from the </w:t>
-      </w:r>
-      <w:proofErr w:type="spellStart"/>
-      <w:r>
-        <w:rPr>
-          <w:lang w:val="en-US"/>
-        </w:rPr>
-        <w:t>UDSDialogManager</w:t>
-      </w:r>
-      <w:proofErr w:type="spellEnd"/>
-      <w:r>
-        <w:rPr>
-          <w:lang w:val="en-US"/>
-        </w:rPr>
-        <w:t xml:space="preserve"> (see 4)</w:t>
+        <w:t>Properties using the Dialog Editor and then access them in your game code inside a method overridden from the UDSDialogManager (see 4)</w:t>
+      </w:r>
+      <w:r>
+        <w:rPr>
+          <w:lang w:val="en-US"/>
+        </w:rPr>
+        <w:t>.</w:t>
       </w:r>
     </w:p>
     <w:p>
@@ -3423,9 +3211,32 @@
           <w:szCs w:val="20"/>
           <w:lang w:val="en-US"/>
         </w:rPr>
-        <w:t>(</w:t>
-      </w:r>
-      <w:proofErr w:type="gramStart"/>
+        <w:t>(e.g. player has reached a certain level or done a certain quest)</w:t>
+      </w:r>
+      <w:r>
+        <w:rPr>
+          <w:lang w:val="en-US"/>
+        </w:rPr>
+        <w:t xml:space="preserve">. </w:t>
+      </w:r>
+      <w:r>
+        <w:rPr>
+          <w:lang w:val="en-US"/>
+        </w:rPr>
+        <w:t xml:space="preserve">This allows you to influence the Dialogs dynamically at runtime. </w:t>
+      </w:r>
+      <w:r>
+        <w:rPr>
+          <w:lang w:val="en-US"/>
+        </w:rPr>
+        <w:t>Conditions</w:t>
+      </w:r>
+      <w:r>
+        <w:rPr>
+          <w:lang w:val="en-US"/>
+        </w:rPr>
+        <w:t xml:space="preserve"> can be set in the editor and are based on the Global Properties, which work just like normal Properties, but are unique and accessible from everywhere in the project. </w:t>
+      </w:r>
       <w:r>
         <w:rPr>
           <w:i/>
@@ -3434,56 +3245,100 @@
           <w:szCs w:val="20"/>
           <w:lang w:val="en-US"/>
         </w:rPr>
-        <w:t>e.g.</w:t>
-      </w:r>
-      <w:proofErr w:type="gramEnd"/>
-      <w:r>
-        <w:rPr>
-          <w:i/>
-          <w:iCs/>
-          <w:sz w:val="24"/>
-          <w:szCs w:val="20"/>
-          <w:lang w:val="en-US"/>
-        </w:rPr>
-        <w:t xml:space="preserve"> player has reached a certain level or done a certain quest)</w:t>
-      </w:r>
-      <w:r>
-        <w:rPr>
-          <w:lang w:val="en-US"/>
-        </w:rPr>
-        <w:t xml:space="preserve">. These conditions can be set in the editor and are based on the Global Properties, which work just like normal Properties, but are unique and accessible from everywhere in the project. </w:t>
-      </w:r>
-      <w:r>
-        <w:rPr>
-          <w:i/>
-          <w:iCs/>
-          <w:sz w:val="24"/>
-          <w:szCs w:val="20"/>
-          <w:lang w:val="en-US"/>
-        </w:rPr>
-        <w:t>(</w:t>
-      </w:r>
-      <w:proofErr w:type="gramStart"/>
-      <w:r>
-        <w:rPr>
-          <w:i/>
-          <w:iCs/>
-          <w:sz w:val="24"/>
-          <w:szCs w:val="20"/>
-          <w:lang w:val="en-US"/>
-        </w:rPr>
-        <w:t>they</w:t>
-      </w:r>
-      <w:proofErr w:type="gramEnd"/>
-      <w:r>
-        <w:rPr>
-          <w:i/>
-          <w:iCs/>
-          <w:sz w:val="24"/>
-          <w:szCs w:val="20"/>
-          <w:lang w:val="en-US"/>
-        </w:rPr>
-        <w:t xml:space="preserve"> can be compared to static variables in C#)</w:t>
+        <w:t>(they can be compared to static variables in C#)</w:t>
+      </w:r>
+      <w:r>
+        <w:rPr>
+          <w:lang w:val="en-US"/>
+        </w:rPr>
+        <w:t xml:space="preserve">. </w:t>
+      </w:r>
+    </w:p>
+    <w:p>
+      <w:pPr>
+        <w:rPr>
+          <w:lang w:val="en-US"/>
+        </w:rPr>
+      </w:pPr>
+      <w:r>
+        <w:rPr>
+          <w:b/>
+          <w:bCs/>
+          <w:lang w:val="en-US"/>
+        </w:rPr>
+        <w:t>An example</w:t>
+      </w:r>
+      <w:r>
+        <w:rPr>
+          <w:lang w:val="en-US"/>
+        </w:rPr>
+        <w:t xml:space="preserve"> would be a Global Property “</w:t>
+      </w:r>
+      <w:r>
+        <w:rPr>
+          <w:lang w:val="en-US"/>
+        </w:rPr>
+        <w:t>Player Level</w:t>
+      </w:r>
+      <w:r>
+        <w:rPr>
+          <w:lang w:val="en-US"/>
+        </w:rPr>
+        <w:t xml:space="preserve">” of type </w:t>
+      </w:r>
+      <w:r>
+        <w:rPr>
+          <w:lang w:val="en-US"/>
+        </w:rPr>
+        <w:t>int</w:t>
+      </w:r>
+      <w:r>
+        <w:rPr>
+          <w:lang w:val="en-US"/>
+        </w:rPr>
+        <w:t xml:space="preserve">. </w:t>
+      </w:r>
+      <w:r>
+        <w:rPr>
+          <w:lang w:val="en-US"/>
+        </w:rPr>
+        <w:t xml:space="preserve">Some </w:t>
+      </w:r>
+      <w:r>
+        <w:rPr>
+          <w:lang w:val="en-US"/>
+        </w:rPr>
+        <w:t>Answers in your Dialogs might then only be shown under the condition “</w:t>
+      </w:r>
+      <w:r>
+        <w:rPr>
+          <w:lang w:val="en-US"/>
+        </w:rPr>
+        <w:t>Player Level &gt;=</w:t>
+      </w:r>
+      <w:r>
+        <w:rPr>
+          <w:lang w:val="en-US"/>
+        </w:rPr>
+        <w:t xml:space="preserve"> </w:t>
+      </w:r>
+      <w:r>
+        <w:rPr>
+          <w:lang w:val="en-US"/>
+        </w:rPr>
+        <w:t>20</w:t>
+      </w:r>
+      <w:r>
+        <w:rPr>
+          <w:lang w:val="en-US"/>
+        </w:rPr>
+        <w:t>”</w:t>
+      </w:r>
+      <w:r>
+        <w:rPr>
+          <w:lang w:val="en-US"/>
+        </w:rPr>
+        <w:t>.</w:t>
       </w:r>
       <w:r>
         <w:rPr>
@@ -3519,26 +3374,268 @@
         <w:rPr>
           <w:lang w:val="en-US"/>
         </w:rPr>
-        <w:t xml:space="preserve"> + How to run the </w:t>
-      </w:r>
-      <w:proofErr w:type="gramStart"/>
-      <w:r>
-        <w:rPr>
-          <w:lang w:val="en-US"/>
-        </w:rPr>
-        <w:t>editor</w:t>
+        <w:t xml:space="preserve"> + How to run the editor</w:t>
       </w:r>
       <w:bookmarkEnd w:id="7"/>
-      <w:proofErr w:type="gramEnd"/>
-    </w:p>
-    <w:p>
-      <w:pPr>
-        <w:rPr>
-          <w:lang w:val="en-US"/>
-        </w:rPr>
-      </w:pPr>
-      <w:r>
-        <w:rPr>
+    </w:p>
+    <w:p>
+      <w:pPr>
+        <w:rPr>
+          <w:lang w:val="en-US"/>
+        </w:rPr>
+      </w:pPr>
+      <w:r>
+        <w:rPr>
+          <w:lang w:val="en-US"/>
+        </w:rPr>
+        <w:t>The Universal Dialog System</w:t>
+      </w:r>
+      <w:r>
+        <w:rPr>
+          <w:lang w:val="en-US"/>
+        </w:rPr>
+        <w:t xml:space="preserve"> (UDS)</w:t>
+      </w:r>
+      <w:r>
+        <w:rPr>
+          <w:lang w:val="en-US"/>
+        </w:rPr>
+        <w:t xml:space="preserve"> asset can be bought and imported into your project via the Unity Asset Store. For a quick walkthrough of how to use it and how to import assets, see this guide by Unity:</w:t>
+      </w:r>
+    </w:p>
+    <w:p>
+      <w:pPr>
+        <w:rPr>
+          <w:lang w:val="en-US"/>
+        </w:rPr>
+      </w:pPr>
+      <w:hyperlink r:id="rId8" w:history="1">
+        <w:r>
+          <w:rPr>
+            <w:rStyle w:val="Hyperlink"/>
+            <w:lang w:val="en-US"/>
+          </w:rPr>
+          <w:t>https://unity3d.com/de/quick-guide-to-unity-asset-store</w:t>
+        </w:r>
+      </w:hyperlink>
+    </w:p>
+    <w:p>
+      <w:pPr>
+        <w:rPr>
+          <w:lang w:val="en-US"/>
+        </w:rPr>
+      </w:pPr>
+      <w:r>
+        <w:rPr>
+          <w:b/>
+          <w:bCs/>
+          <w:lang w:val="en-US"/>
+        </w:rPr>
+        <w:t>Note that the asset “JSON .NET For Unity” is a requirement for the UDS.</w:t>
+      </w:r>
+      <w:r>
+        <w:rPr>
+          <w:lang w:val="en-US"/>
+        </w:rPr>
+        <w:t xml:space="preserve"> It is currently available for free in the Unity asset store under</w:t>
+      </w:r>
+    </w:p>
+    <w:p>
+      <w:pPr>
+        <w:rPr>
+          <w:lang w:val="en-US"/>
+        </w:rPr>
+      </w:pPr>
+      <w:hyperlink r:id="rId9" w:history="1">
+        <w:r>
+          <w:rPr>
+            <w:rStyle w:val="Hyperlink"/>
+            <w:lang w:val="en-US"/>
+          </w:rPr>
+          <w:t>https://assetstore.unity.com/packages/tools/input-management/json-net-for-unity-11347</w:t>
+        </w:r>
+      </w:hyperlink>
+    </w:p>
+    <w:p>
+      <w:pPr>
+        <w:rPr>
+          <w:lang w:val="en-US"/>
+        </w:rPr>
+      </w:pPr>
+    </w:p>
+    <w:p>
+      <w:pPr>
+        <w:rPr>
+          <w:lang w:val="en-US"/>
+        </w:rPr>
+      </w:pPr>
+      <w:r>
+        <w:rPr>
+          <w:lang w:val="en-US"/>
+        </w:rPr>
+        <w:t xml:space="preserve">The most important components in the package are the UDSDialogManager script and the Dialog Editor. </w:t>
+      </w:r>
+      <w:r>
+        <w:rPr>
+          <w:b/>
+          <w:bCs/>
+          <w:lang w:val="en-US"/>
+        </w:rPr>
+        <w:t>The Dialog Editor is included as a zip folder, which you should unpack.</w:t>
+      </w:r>
+      <w:r>
+        <w:rPr>
+          <w:lang w:val="en-US"/>
+        </w:rPr>
+        <w:t xml:space="preserve"> You can then run the Editor from the included .exe file. </w:t>
+      </w:r>
+    </w:p>
+    <w:p>
+      <w:pPr>
+        <w:rPr>
+          <w:i/>
+          <w:iCs/>
+          <w:sz w:val="24"/>
+          <w:szCs w:val="20"/>
+          <w:lang w:val="en-US"/>
+        </w:rPr>
+      </w:pPr>
+      <w:r>
+        <w:rPr>
+          <w:i/>
+          <w:iCs/>
+          <w:sz w:val="24"/>
+          <w:szCs w:val="20"/>
+          <w:lang w:val="en-US"/>
+        </w:rPr>
+        <w:t>Note: The Dialog Editor itself was also made in Unity (which also ensures maximum compatibility) and was built using Unity</w:t>
+      </w:r>
+      <w:r>
+        <w:rPr>
+          <w:i/>
+          <w:iCs/>
+          <w:sz w:val="24"/>
+          <w:szCs w:val="20"/>
+          <w:lang w:val="en-US"/>
+        </w:rPr>
+        <w:t>.</w:t>
+      </w:r>
+      <w:r>
+        <w:rPr>
+          <w:i/>
+          <w:iCs/>
+          <w:sz w:val="24"/>
+          <w:szCs w:val="20"/>
+          <w:lang w:val="en-US"/>
+        </w:rPr>
+        <w:t xml:space="preserve">   </w:t>
+      </w:r>
+    </w:p>
+    <w:p>
+      <w:pPr>
+        <w:rPr>
+          <w:i/>
+          <w:iCs/>
+          <w:sz w:val="24"/>
+          <w:szCs w:val="20"/>
+          <w:lang w:val="en-US"/>
+        </w:rPr>
+      </w:pPr>
+    </w:p>
+    <w:p>
+      <w:pPr>
+        <w:rPr>
+          <w:i/>
+          <w:iCs/>
+          <w:lang w:val="en-US"/>
+        </w:rPr>
+      </w:pPr>
+      <w:r>
+        <w:rPr>
+          <w:lang w:val="en-US"/>
+        </w:rPr>
+        <w:t xml:space="preserve">The package also includes an example project with several example scripts. These are described in more depth under “3. Quick Start”. To get started with the UDS you should take a look at the </w:t>
+      </w:r>
+      <w:r>
+        <w:rPr>
+          <w:i/>
+          <w:iCs/>
+          <w:lang w:val="en-US"/>
+        </w:rPr>
+        <w:t>UDSDialogStarter</w:t>
+      </w:r>
+      <w:r>
+        <w:rPr>
+          <w:lang w:val="en-US"/>
+        </w:rPr>
+        <w:t xml:space="preserve"> and </w:t>
+      </w:r>
+      <w:r>
+        <w:rPr>
+          <w:i/>
+          <w:iCs/>
+          <w:lang w:val="en-US"/>
+        </w:rPr>
+        <w:t>UDSPlayerDialog</w:t>
+      </w:r>
+      <w:r>
+        <w:rPr>
+          <w:lang w:val="en-US"/>
+        </w:rPr>
+        <w:t xml:space="preserve"> scripts in the example project as well as the example player and NPC in the scene. You can copy these into your game as they provide a quick and simple way to include Dialogs into your game (start Dialogs when the player comes close to </w:t>
+      </w:r>
+      <w:r>
+        <w:rPr>
+          <w:lang w:val="en-US"/>
+        </w:rPr>
+        <w:t>an</w:t>
+      </w:r>
+      <w:r>
+        <w:rPr>
+          <w:lang w:val="en-US"/>
+        </w:rPr>
+        <w:t xml:space="preserve"> NPC and presses a button). </w:t>
+      </w:r>
+      <w:r>
+        <w:rPr>
+          <w:b/>
+          <w:bCs/>
+          <w:lang w:val="en-US"/>
+        </w:rPr>
+        <w:t>However, these are only example scripts and I encourage you to look into them and extend them as needed.</w:t>
+      </w:r>
+      <w:r>
+        <w:rPr>
+          <w:b/>
+          <w:bCs/>
+          <w:lang w:val="en-US"/>
+        </w:rPr>
+        <w:t xml:space="preserve"> </w:t>
+      </w:r>
+      <w:r>
+        <w:rPr>
+          <w:lang w:val="en-US"/>
+        </w:rPr>
+        <w:t xml:space="preserve">Just like the </w:t>
+      </w:r>
+      <w:r>
+        <w:rPr>
+          <w:i/>
+          <w:iCs/>
+          <w:lang w:val="en-US"/>
+        </w:rPr>
+        <w:t xml:space="preserve">UDSDialogManager </w:t>
+      </w:r>
+      <w:r>
+        <w:rPr>
+          <w:lang w:val="en-US"/>
+        </w:rPr>
+        <w:t>script these are also well commented to help you with understanding.</w:t>
+      </w:r>
+      <w:r>
+        <w:rPr>
+          <w:i/>
+          <w:iCs/>
           <w:lang w:val="en-US"/>
         </w:rPr>
         <w:br w:type="page"/>
@@ -3573,17 +3670,9 @@
         <w:rPr>
           <w:lang w:val="en-US"/>
         </w:rPr>
-        <w:t xml:space="preserve"> and making a </w:t>
-      </w:r>
-      <w:proofErr w:type="gramStart"/>
-      <w:r>
-        <w:rPr>
-          <w:lang w:val="en-US"/>
-        </w:rPr>
-        <w:t>Dialog</w:t>
+        <w:t xml:space="preserve"> and making a Dialog</w:t>
       </w:r>
       <w:bookmarkEnd w:id="8"/>
-      <w:proofErr w:type="gramEnd"/>
     </w:p>
     <w:p>
       <w:pPr>
@@ -3633,21 +3722,7 @@
         <w:rPr>
           <w:lang w:val="en-US"/>
         </w:rPr>
-        <w:t xml:space="preserve">and </w:t>
-      </w:r>
-      <w:proofErr w:type="spellStart"/>
-      <w:r>
-        <w:rPr>
-          <w:lang w:val="en-US"/>
-        </w:rPr>
-        <w:t>UDSDialogManager</w:t>
-      </w:r>
-      <w:proofErr w:type="spellEnd"/>
-      <w:r>
-        <w:rPr>
-          <w:lang w:val="en-US"/>
-        </w:rPr>
-        <w:t xml:space="preserve"> </w:t>
+        <w:t xml:space="preserve">and UDSDialogManager </w:t>
       </w:r>
       <w:r>
         <w:rPr>
@@ -3745,17 +3820,9 @@
         <w:rPr>
           <w:lang w:val="en-US"/>
         </w:rPr>
-        <w:t xml:space="preserve"> own </w:t>
-      </w:r>
-      <w:proofErr w:type="gramStart"/>
-      <w:r>
-        <w:rPr>
-          <w:lang w:val="en-US"/>
-        </w:rPr>
-        <w:t>functionality</w:t>
+        <w:t xml:space="preserve"> own functionality</w:t>
       </w:r>
       <w:bookmarkEnd w:id="13"/>
-      <w:proofErr w:type="gramEnd"/>
     </w:p>
     <w:p>
       <w:pPr>
@@ -3773,17 +3840,9 @@
         <w:rPr>
           <w:lang w:val="en-US"/>
         </w:rPr>
-        <w:t xml:space="preserve">Dialog Components and working with </w:t>
-      </w:r>
-      <w:proofErr w:type="gramStart"/>
-      <w:r>
-        <w:rPr>
-          <w:lang w:val="en-US"/>
-        </w:rPr>
-        <w:t>Properties</w:t>
+        <w:t>Dialog Components and working with Properties</w:t>
       </w:r>
       <w:bookmarkEnd w:id="14"/>
-      <w:proofErr w:type="gramEnd"/>
     </w:p>
     <w:p>
       <w:pPr>
@@ -3807,21 +3866,7 @@
         <w:rPr>
           <w:lang w:val="en-US"/>
         </w:rPr>
-        <w:t xml:space="preserve">ocumentation for the </w:t>
-      </w:r>
-      <w:proofErr w:type="spellStart"/>
-      <w:r>
-        <w:rPr>
-          <w:lang w:val="en-US"/>
-        </w:rPr>
-        <w:t>UDSDialogManager</w:t>
-      </w:r>
-      <w:proofErr w:type="spellEnd"/>
-      <w:r>
-        <w:rPr>
-          <w:lang w:val="en-US"/>
-        </w:rPr>
-        <w:t xml:space="preserve"> class</w:t>
+        <w:t>ocumentation for the UDSDialogManager class</w:t>
       </w:r>
       <w:bookmarkEnd w:id="15"/>
     </w:p>
@@ -3875,21 +3920,7 @@
         <w:rPr>
           <w:lang w:val="en-US"/>
         </w:rPr>
-        <w:t xml:space="preserve">Creating, </w:t>
-      </w:r>
-      <w:proofErr w:type="gramStart"/>
-      <w:r>
-        <w:rPr>
-          <w:lang w:val="en-US"/>
-        </w:rPr>
-        <w:t>saving</w:t>
-      </w:r>
-      <w:proofErr w:type="gramEnd"/>
-      <w:r>
-        <w:rPr>
-          <w:lang w:val="en-US"/>
-        </w:rPr>
-        <w:t xml:space="preserve"> and loading Dialogs</w:t>
+        <w:t>Creating, saving and loading Dialogs</w:t>
       </w:r>
       <w:bookmarkEnd w:id="17"/>
     </w:p>
@@ -3996,26 +4027,12 @@
           <w:lang w:val="en-US"/>
         </w:rPr>
         <w:lastRenderedPageBreak/>
-        <w:t xml:space="preserve">What the UDS </w:t>
-      </w:r>
-      <w:proofErr w:type="gramStart"/>
-      <w:r>
-        <w:rPr>
-          <w:lang w:val="en-US"/>
-        </w:rPr>
-        <w:t>can’t</w:t>
-      </w:r>
-      <w:proofErr w:type="gramEnd"/>
-      <w:r>
-        <w:rPr>
-          <w:lang w:val="en-US"/>
-        </w:rPr>
-        <w:t xml:space="preserve"> do + Known issues</w:t>
+        <w:t>What the UDS can’t do + Known issues</w:t>
       </w:r>
       <w:bookmarkEnd w:id="21"/>
     </w:p>
     <w:sectPr>
-      <w:headerReference w:type="default" r:id="rId8"/>
+      <w:headerReference w:type="default" r:id="rId10"/>
       <w:pgSz w:w="11906" w:h="16838"/>
       <w:pgMar w:top="1417" w:right="1417" w:bottom="1134" w:left="1417" w:header="708" w:footer="708" w:gutter="0"/>
       <w:cols w:space="708"/>
@@ -4085,6 +4102,7 @@
         <w:docPartUnique/>
       </w:docPartObj>
     </w:sdtPr>
+    <w:sdtEndPr/>
     <w:sdtContent>
       <w:p>
         <w:pPr>
@@ -4694,6 +4712,7 @@
   <w:style w:type="character" w:default="1" w:styleId="Absatz-Standardschriftart">
     <w:name w:val="Default Paragraph Font"/>
     <w:uiPriority w:val="1"/>
+    <w:semiHidden/>
     <w:unhideWhenUsed/>
   </w:style>
   <w:style w:type="table" w:default="1" w:styleId="NormaleTabelle">
@@ -4856,6 +4875,18 @@
       <w:ind w:left="720"/>
       <w:contextualSpacing/>
     </w:pPr>
+  </w:style>
+  <w:style w:type="character" w:styleId="NichtaufgelsteErwhnung">
+    <w:name w:val="Unresolved Mention"/>
+    <w:basedOn w:val="Absatz-Standardschriftart"/>
+    <w:uiPriority w:val="99"/>
+    <w:semiHidden/>
+    <w:unhideWhenUsed/>
+    <w:rsid w:val="002D4621"/>
+    <w:rPr>
+      <w:color w:val="605E5C"/>
+      <w:shd w:val="clear" w:color="auto" w:fill="E1DFDD"/>
+    </w:rPr>
   </w:style>
 </w:styles>
 </file>

</xml_diff>

<commit_message>
Global Properties and conditional Answers in DialogManager + Refactoring and fixes
Global Properties and conditional Answers in DialogManager + Refactoring and fixes
</commit_message>
<xml_diff>
--- a/Universal Dialog Editor/UDS Documentation.docx
+++ b/Universal Dialog Editor/UDS Documentation.docx
@@ -75,7 +75,7 @@
             </w:rPr>
             <w:fldChar w:fldCharType="separate"/>
           </w:r>
-          <w:hyperlink w:anchor="_Toc76918437" w:history="1">
+          <w:hyperlink w:anchor="_Toc77091255" w:history="1">
             <w:r>
               <w:rPr>
                 <w:rStyle w:val="Hyperlink"/>
@@ -103,7 +103,7 @@
                 <w:noProof/>
                 <w:webHidden/>
               </w:rPr>
-              <w:instrText xml:space="preserve"> PAGEREF _Toc76918437 \h </w:instrText>
+              <w:instrText xml:space="preserve"> PAGEREF _Toc77091255 \h </w:instrText>
             </w:r>
             <w:r>
               <w:rPr>
@@ -148,7 +148,7 @@
               <w:lang w:eastAsia="de-DE"/>
             </w:rPr>
           </w:pPr>
-          <w:hyperlink w:anchor="_Toc76918438" w:history="1">
+          <w:hyperlink w:anchor="_Toc77091256" w:history="1">
             <w:r>
               <w:rPr>
                 <w:rStyle w:val="Hyperlink"/>
@@ -193,7 +193,7 @@
                 <w:noProof/>
                 <w:webHidden/>
               </w:rPr>
-              <w:instrText xml:space="preserve"> PAGEREF _Toc76918438 \h </w:instrText>
+              <w:instrText xml:space="preserve"> PAGEREF _Toc77091256 \h </w:instrText>
             </w:r>
             <w:r>
               <w:rPr>
@@ -238,7 +238,7 @@
               <w:lang w:eastAsia="de-DE"/>
             </w:rPr>
           </w:pPr>
-          <w:hyperlink w:anchor="_Toc76918439" w:history="1">
+          <w:hyperlink w:anchor="_Toc77091257" w:history="1">
             <w:r>
               <w:rPr>
                 <w:rStyle w:val="Hyperlink"/>
@@ -283,7 +283,7 @@
                 <w:noProof/>
                 <w:webHidden/>
               </w:rPr>
-              <w:instrText xml:space="preserve"> PAGEREF _Toc76918439 \h </w:instrText>
+              <w:instrText xml:space="preserve"> PAGEREF _Toc77091257 \h </w:instrText>
             </w:r>
             <w:r>
               <w:rPr>
@@ -328,7 +328,7 @@
               <w:lang w:eastAsia="de-DE"/>
             </w:rPr>
           </w:pPr>
-          <w:hyperlink w:anchor="_Toc76918440" w:history="1">
+          <w:hyperlink w:anchor="_Toc77091258" w:history="1">
             <w:r>
               <w:rPr>
                 <w:rStyle w:val="Hyperlink"/>
@@ -373,7 +373,7 @@
                 <w:noProof/>
                 <w:webHidden/>
               </w:rPr>
-              <w:instrText xml:space="preserve"> PAGEREF _Toc76918440 \h </w:instrText>
+              <w:instrText xml:space="preserve"> PAGEREF _Toc77091258 \h </w:instrText>
             </w:r>
             <w:r>
               <w:rPr>
@@ -418,7 +418,7 @@
               <w:lang w:eastAsia="de-DE"/>
             </w:rPr>
           </w:pPr>
-          <w:hyperlink w:anchor="_Toc76918441" w:history="1">
+          <w:hyperlink w:anchor="_Toc77091259" w:history="1">
             <w:r>
               <w:rPr>
                 <w:rStyle w:val="Hyperlink"/>
@@ -463,7 +463,7 @@
                 <w:noProof/>
                 <w:webHidden/>
               </w:rPr>
-              <w:instrText xml:space="preserve"> PAGEREF _Toc76918441 \h </w:instrText>
+              <w:instrText xml:space="preserve"> PAGEREF _Toc77091259 \h </w:instrText>
             </w:r>
             <w:r>
               <w:rPr>
@@ -483,7 +483,7 @@
                 <w:noProof/>
                 <w:webHidden/>
               </w:rPr>
-              <w:t>4</w:t>
+              <w:t>5</w:t>
             </w:r>
             <w:r>
               <w:rPr>
@@ -508,7 +508,7 @@
               <w:lang w:eastAsia="de-DE"/>
             </w:rPr>
           </w:pPr>
-          <w:hyperlink w:anchor="_Toc76918442" w:history="1">
+          <w:hyperlink w:anchor="_Toc77091260" w:history="1">
             <w:r>
               <w:rPr>
                 <w:rStyle w:val="Hyperlink"/>
@@ -553,7 +553,7 @@
                 <w:noProof/>
                 <w:webHidden/>
               </w:rPr>
-              <w:instrText xml:space="preserve"> PAGEREF _Toc76918442 \h </w:instrText>
+              <w:instrText xml:space="preserve"> PAGEREF _Toc77091260 \h </w:instrText>
             </w:r>
             <w:r>
               <w:rPr>
@@ -598,7 +598,7 @@
               <w:lang w:eastAsia="de-DE"/>
             </w:rPr>
           </w:pPr>
-          <w:hyperlink w:anchor="_Toc76918443" w:history="1">
+          <w:hyperlink w:anchor="_Toc77091261" w:history="1">
             <w:r>
               <w:rPr>
                 <w:rStyle w:val="Hyperlink"/>
@@ -643,7 +643,7 @@
                 <w:noProof/>
                 <w:webHidden/>
               </w:rPr>
-              <w:instrText xml:space="preserve"> PAGEREF _Toc76918443 \h </w:instrText>
+              <w:instrText xml:space="preserve"> PAGEREF _Toc77091261 \h </w:instrText>
             </w:r>
             <w:r>
               <w:rPr>
@@ -688,7 +688,7 @@
               <w:lang w:eastAsia="de-DE"/>
             </w:rPr>
           </w:pPr>
-          <w:hyperlink w:anchor="_Toc76918444" w:history="1">
+          <w:hyperlink w:anchor="_Toc77091262" w:history="1">
             <w:r>
               <w:rPr>
                 <w:rStyle w:val="Hyperlink"/>
@@ -733,7 +733,7 @@
                 <w:noProof/>
                 <w:webHidden/>
               </w:rPr>
-              <w:instrText xml:space="preserve"> PAGEREF _Toc76918444 \h </w:instrText>
+              <w:instrText xml:space="preserve"> PAGEREF _Toc77091262 \h </w:instrText>
             </w:r>
             <w:r>
               <w:rPr>
@@ -778,7 +778,7 @@
               <w:lang w:eastAsia="de-DE"/>
             </w:rPr>
           </w:pPr>
-          <w:hyperlink w:anchor="_Toc76918445" w:history="1">
+          <w:hyperlink w:anchor="_Toc77091263" w:history="1">
             <w:r>
               <w:rPr>
                 <w:rStyle w:val="Hyperlink"/>
@@ -823,7 +823,7 @@
                 <w:noProof/>
                 <w:webHidden/>
               </w:rPr>
-              <w:instrText xml:space="preserve"> PAGEREF _Toc76918445 \h </w:instrText>
+              <w:instrText xml:space="preserve"> PAGEREF _Toc77091263 \h </w:instrText>
             </w:r>
             <w:r>
               <w:rPr>
@@ -868,7 +868,7 @@
               <w:lang w:eastAsia="de-DE"/>
             </w:rPr>
           </w:pPr>
-          <w:hyperlink w:anchor="_Toc76918446" w:history="1">
+          <w:hyperlink w:anchor="_Toc77091264" w:history="1">
             <w:r>
               <w:rPr>
                 <w:rStyle w:val="Hyperlink"/>
@@ -913,7 +913,7 @@
                 <w:noProof/>
                 <w:webHidden/>
               </w:rPr>
-              <w:instrText xml:space="preserve"> PAGEREF _Toc76918446 \h </w:instrText>
+              <w:instrText xml:space="preserve"> PAGEREF _Toc77091264 \h </w:instrText>
             </w:r>
             <w:r>
               <w:rPr>
@@ -958,7 +958,7 @@
               <w:lang w:eastAsia="de-DE"/>
             </w:rPr>
           </w:pPr>
-          <w:hyperlink w:anchor="_Toc76918447" w:history="1">
+          <w:hyperlink w:anchor="_Toc77091265" w:history="1">
             <w:r>
               <w:rPr>
                 <w:rStyle w:val="Hyperlink"/>
@@ -1003,7 +1003,7 @@
                 <w:noProof/>
                 <w:webHidden/>
               </w:rPr>
-              <w:instrText xml:space="preserve"> PAGEREF _Toc76918447 \h </w:instrText>
+              <w:instrText xml:space="preserve"> PAGEREF _Toc77091265 \h </w:instrText>
             </w:r>
             <w:r>
               <w:rPr>
@@ -1048,7 +1048,7 @@
               <w:lang w:eastAsia="de-DE"/>
             </w:rPr>
           </w:pPr>
-          <w:hyperlink w:anchor="_Toc76918448" w:history="1">
+          <w:hyperlink w:anchor="_Toc77091266" w:history="1">
             <w:r>
               <w:rPr>
                 <w:rStyle w:val="Hyperlink"/>
@@ -1093,7 +1093,7 @@
                 <w:noProof/>
                 <w:webHidden/>
               </w:rPr>
-              <w:instrText xml:space="preserve"> PAGEREF _Toc76918448 \h </w:instrText>
+              <w:instrText xml:space="preserve"> PAGEREF _Toc77091266 \h </w:instrText>
             </w:r>
             <w:r>
               <w:rPr>
@@ -1138,7 +1138,7 @@
               <w:lang w:eastAsia="de-DE"/>
             </w:rPr>
           </w:pPr>
-          <w:hyperlink w:anchor="_Toc76918449" w:history="1">
+          <w:hyperlink w:anchor="_Toc77091267" w:history="1">
             <w:r>
               <w:rPr>
                 <w:rStyle w:val="Hyperlink"/>
@@ -1183,7 +1183,7 @@
                 <w:noProof/>
                 <w:webHidden/>
               </w:rPr>
-              <w:instrText xml:space="preserve"> PAGEREF _Toc76918449 \h </w:instrText>
+              <w:instrText xml:space="preserve"> PAGEREF _Toc77091267 \h </w:instrText>
             </w:r>
             <w:r>
               <w:rPr>
@@ -1228,7 +1228,7 @@
               <w:lang w:eastAsia="de-DE"/>
             </w:rPr>
           </w:pPr>
-          <w:hyperlink w:anchor="_Toc76918450" w:history="1">
+          <w:hyperlink w:anchor="_Toc77091268" w:history="1">
             <w:r>
               <w:rPr>
                 <w:rStyle w:val="Hyperlink"/>
@@ -1273,7 +1273,7 @@
                 <w:noProof/>
                 <w:webHidden/>
               </w:rPr>
-              <w:instrText xml:space="preserve"> PAGEREF _Toc76918450 \h </w:instrText>
+              <w:instrText xml:space="preserve"> PAGEREF _Toc77091268 \h </w:instrText>
             </w:r>
             <w:r>
               <w:rPr>
@@ -1318,7 +1318,7 @@
               <w:lang w:eastAsia="de-DE"/>
             </w:rPr>
           </w:pPr>
-          <w:hyperlink w:anchor="_Toc76918451" w:history="1">
+          <w:hyperlink w:anchor="_Toc77091269" w:history="1">
             <w:r>
               <w:rPr>
                 <w:rStyle w:val="Hyperlink"/>
@@ -1363,7 +1363,7 @@
                 <w:noProof/>
                 <w:webHidden/>
               </w:rPr>
-              <w:instrText xml:space="preserve"> PAGEREF _Toc76918451 \h </w:instrText>
+              <w:instrText xml:space="preserve"> PAGEREF _Toc77091269 \h </w:instrText>
             </w:r>
             <w:r>
               <w:rPr>
@@ -1408,7 +1408,7 @@
               <w:lang w:eastAsia="de-DE"/>
             </w:rPr>
           </w:pPr>
-          <w:hyperlink w:anchor="_Toc76918452" w:history="1">
+          <w:hyperlink w:anchor="_Toc77091270" w:history="1">
             <w:r>
               <w:rPr>
                 <w:rStyle w:val="Hyperlink"/>
@@ -1453,7 +1453,7 @@
                 <w:noProof/>
                 <w:webHidden/>
               </w:rPr>
-              <w:instrText xml:space="preserve"> PAGEREF _Toc76918452 \h </w:instrText>
+              <w:instrText xml:space="preserve"> PAGEREF _Toc77091270 \h </w:instrText>
             </w:r>
             <w:r>
               <w:rPr>
@@ -1498,7 +1498,7 @@
               <w:lang w:eastAsia="de-DE"/>
             </w:rPr>
           </w:pPr>
-          <w:hyperlink w:anchor="_Toc76918453" w:history="1">
+          <w:hyperlink w:anchor="_Toc77091271" w:history="1">
             <w:r>
               <w:rPr>
                 <w:rStyle w:val="Hyperlink"/>
@@ -1543,7 +1543,7 @@
                 <w:noProof/>
                 <w:webHidden/>
               </w:rPr>
-              <w:instrText xml:space="preserve"> PAGEREF _Toc76918453 \h </w:instrText>
+              <w:instrText xml:space="preserve"> PAGEREF _Toc77091271 \h </w:instrText>
             </w:r>
             <w:r>
               <w:rPr>
@@ -1588,7 +1588,7 @@
               <w:lang w:eastAsia="de-DE"/>
             </w:rPr>
           </w:pPr>
-          <w:hyperlink w:anchor="_Toc76918454" w:history="1">
+          <w:hyperlink w:anchor="_Toc77091272" w:history="1">
             <w:r>
               <w:rPr>
                 <w:rStyle w:val="Hyperlink"/>
@@ -1633,7 +1633,7 @@
                 <w:noProof/>
                 <w:webHidden/>
               </w:rPr>
-              <w:instrText xml:space="preserve"> PAGEREF _Toc76918454 \h </w:instrText>
+              <w:instrText xml:space="preserve"> PAGEREF _Toc77091272 \h </w:instrText>
             </w:r>
             <w:r>
               <w:rPr>
@@ -1678,7 +1678,7 @@
               <w:lang w:eastAsia="de-DE"/>
             </w:rPr>
           </w:pPr>
-          <w:hyperlink w:anchor="_Toc76918455" w:history="1">
+          <w:hyperlink w:anchor="_Toc77091273" w:history="1">
             <w:r>
               <w:rPr>
                 <w:rStyle w:val="Hyperlink"/>
@@ -1723,7 +1723,7 @@
                 <w:noProof/>
                 <w:webHidden/>
               </w:rPr>
-              <w:instrText xml:space="preserve"> PAGEREF _Toc76918455 \h </w:instrText>
+              <w:instrText xml:space="preserve"> PAGEREF _Toc77091273 \h </w:instrText>
             </w:r>
             <w:r>
               <w:rPr>
@@ -1768,7 +1768,7 @@
               <w:lang w:eastAsia="de-DE"/>
             </w:rPr>
           </w:pPr>
-          <w:hyperlink w:anchor="_Toc76918456" w:history="1">
+          <w:hyperlink w:anchor="_Toc77091274" w:history="1">
             <w:r>
               <w:rPr>
                 <w:rStyle w:val="Hyperlink"/>
@@ -1813,7 +1813,7 @@
                 <w:noProof/>
                 <w:webHidden/>
               </w:rPr>
-              <w:instrText xml:space="preserve"> PAGEREF _Toc76918456 \h </w:instrText>
+              <w:instrText xml:space="preserve"> PAGEREF _Toc77091274 \h </w:instrText>
             </w:r>
             <w:r>
               <w:rPr>
@@ -1858,7 +1858,7 @@
               <w:lang w:eastAsia="de-DE"/>
             </w:rPr>
           </w:pPr>
-          <w:hyperlink w:anchor="_Toc76918457" w:history="1">
+          <w:hyperlink w:anchor="_Toc77091275" w:history="1">
             <w:r>
               <w:rPr>
                 <w:rStyle w:val="Hyperlink"/>
@@ -1903,7 +1903,7 @@
                 <w:noProof/>
                 <w:webHidden/>
               </w:rPr>
-              <w:instrText xml:space="preserve"> PAGEREF _Toc76918457 \h </w:instrText>
+              <w:instrText xml:space="preserve"> PAGEREF _Toc77091275 \h </w:instrText>
             </w:r>
             <w:r>
               <w:rPr>
@@ -1948,7 +1948,7 @@
               <w:lang w:eastAsia="de-DE"/>
             </w:rPr>
           </w:pPr>
-          <w:hyperlink w:anchor="_Toc76918458" w:history="1">
+          <w:hyperlink w:anchor="_Toc77091276" w:history="1">
             <w:r>
               <w:rPr>
                 <w:rStyle w:val="Hyperlink"/>
@@ -1972,6 +1972,276 @@
                 <w:noProof/>
                 <w:lang w:val="en-US"/>
               </w:rPr>
+              <w:t>Examples</w:t>
+            </w:r>
+            <w:r>
+              <w:rPr>
+                <w:noProof/>
+                <w:webHidden/>
+              </w:rPr>
+              <w:tab/>
+            </w:r>
+            <w:r>
+              <w:rPr>
+                <w:noProof/>
+                <w:webHidden/>
+              </w:rPr>
+              <w:fldChar w:fldCharType="begin"/>
+            </w:r>
+            <w:r>
+              <w:rPr>
+                <w:noProof/>
+                <w:webHidden/>
+              </w:rPr>
+              <w:instrText xml:space="preserve"> PAGEREF _Toc77091276 \h </w:instrText>
+            </w:r>
+            <w:r>
+              <w:rPr>
+                <w:noProof/>
+                <w:webHidden/>
+              </w:rPr>
+            </w:r>
+            <w:r>
+              <w:rPr>
+                <w:noProof/>
+                <w:webHidden/>
+              </w:rPr>
+              <w:fldChar w:fldCharType="separate"/>
+            </w:r>
+            <w:r>
+              <w:rPr>
+                <w:noProof/>
+                <w:webHidden/>
+              </w:rPr>
+              <w:t>10</w:t>
+            </w:r>
+            <w:r>
+              <w:rPr>
+                <w:noProof/>
+                <w:webHidden/>
+              </w:rPr>
+              <w:fldChar w:fldCharType="end"/>
+            </w:r>
+          </w:hyperlink>
+        </w:p>
+        <w:p>
+          <w:pPr>
+            <w:pStyle w:val="Verzeichnis2"/>
+            <w:tabs>
+              <w:tab w:val="left" w:pos="1100"/>
+              <w:tab w:val="right" w:leader="dot" w:pos="9062"/>
+            </w:tabs>
+            <w:rPr>
+              <w:rFonts w:asciiTheme="minorHAnsi" w:eastAsiaTheme="minorEastAsia" w:hAnsiTheme="minorHAnsi"/>
+              <w:noProof/>
+              <w:sz w:val="22"/>
+              <w:lang w:eastAsia="de-DE"/>
+            </w:rPr>
+          </w:pPr>
+          <w:hyperlink w:anchor="_Toc77091277" w:history="1">
+            <w:r>
+              <w:rPr>
+                <w:rStyle w:val="Hyperlink"/>
+                <w:noProof/>
+                <w:lang w:val="en-US"/>
+              </w:rPr>
+              <w:t>6.1.</w:t>
+            </w:r>
+            <w:r>
+              <w:rPr>
+                <w:rFonts w:asciiTheme="minorHAnsi" w:eastAsiaTheme="minorEastAsia" w:hAnsiTheme="minorHAnsi"/>
+                <w:noProof/>
+                <w:sz w:val="22"/>
+                <w:lang w:eastAsia="de-DE"/>
+              </w:rPr>
+              <w:tab/>
+            </w:r>
+            <w:r>
+              <w:rPr>
+                <w:rStyle w:val="Hyperlink"/>
+                <w:noProof/>
+                <w:lang w:val="en-US"/>
+              </w:rPr>
+              <w:t>Opening a shop during a Dialog</w:t>
+            </w:r>
+            <w:r>
+              <w:rPr>
+                <w:noProof/>
+                <w:webHidden/>
+              </w:rPr>
+              <w:tab/>
+            </w:r>
+            <w:r>
+              <w:rPr>
+                <w:noProof/>
+                <w:webHidden/>
+              </w:rPr>
+              <w:fldChar w:fldCharType="begin"/>
+            </w:r>
+            <w:r>
+              <w:rPr>
+                <w:noProof/>
+                <w:webHidden/>
+              </w:rPr>
+              <w:instrText xml:space="preserve"> PAGEREF _Toc77091277 \h </w:instrText>
+            </w:r>
+            <w:r>
+              <w:rPr>
+                <w:noProof/>
+                <w:webHidden/>
+              </w:rPr>
+            </w:r>
+            <w:r>
+              <w:rPr>
+                <w:noProof/>
+                <w:webHidden/>
+              </w:rPr>
+              <w:fldChar w:fldCharType="separate"/>
+            </w:r>
+            <w:r>
+              <w:rPr>
+                <w:noProof/>
+                <w:webHidden/>
+              </w:rPr>
+              <w:t>10</w:t>
+            </w:r>
+            <w:r>
+              <w:rPr>
+                <w:noProof/>
+                <w:webHidden/>
+              </w:rPr>
+              <w:fldChar w:fldCharType="end"/>
+            </w:r>
+          </w:hyperlink>
+        </w:p>
+        <w:p>
+          <w:pPr>
+            <w:pStyle w:val="Verzeichnis2"/>
+            <w:tabs>
+              <w:tab w:val="left" w:pos="1100"/>
+              <w:tab w:val="right" w:leader="dot" w:pos="9062"/>
+            </w:tabs>
+            <w:rPr>
+              <w:rFonts w:asciiTheme="minorHAnsi" w:eastAsiaTheme="minorEastAsia" w:hAnsiTheme="minorHAnsi"/>
+              <w:noProof/>
+              <w:sz w:val="22"/>
+              <w:lang w:eastAsia="de-DE"/>
+            </w:rPr>
+          </w:pPr>
+          <w:hyperlink w:anchor="_Toc77091278" w:history="1">
+            <w:r>
+              <w:rPr>
+                <w:rStyle w:val="Hyperlink"/>
+                <w:noProof/>
+                <w:lang w:val="en-US"/>
+              </w:rPr>
+              <w:t>6.2.</w:t>
+            </w:r>
+            <w:r>
+              <w:rPr>
+                <w:rFonts w:asciiTheme="minorHAnsi" w:eastAsiaTheme="minorEastAsia" w:hAnsiTheme="minorHAnsi"/>
+                <w:noProof/>
+                <w:sz w:val="22"/>
+                <w:lang w:eastAsia="de-DE"/>
+              </w:rPr>
+              <w:tab/>
+            </w:r>
+            <w:r>
+              <w:rPr>
+                <w:rStyle w:val="Hyperlink"/>
+                <w:noProof/>
+                <w:lang w:val="en-US"/>
+              </w:rPr>
+              <w:t>Showing to the player what an Answer does</w:t>
+            </w:r>
+            <w:r>
+              <w:rPr>
+                <w:noProof/>
+                <w:webHidden/>
+              </w:rPr>
+              <w:tab/>
+            </w:r>
+            <w:r>
+              <w:rPr>
+                <w:noProof/>
+                <w:webHidden/>
+              </w:rPr>
+              <w:fldChar w:fldCharType="begin"/>
+            </w:r>
+            <w:r>
+              <w:rPr>
+                <w:noProof/>
+                <w:webHidden/>
+              </w:rPr>
+              <w:instrText xml:space="preserve"> PAGEREF _Toc77091278 \h </w:instrText>
+            </w:r>
+            <w:r>
+              <w:rPr>
+                <w:noProof/>
+                <w:webHidden/>
+              </w:rPr>
+            </w:r>
+            <w:r>
+              <w:rPr>
+                <w:noProof/>
+                <w:webHidden/>
+              </w:rPr>
+              <w:fldChar w:fldCharType="separate"/>
+            </w:r>
+            <w:r>
+              <w:rPr>
+                <w:noProof/>
+                <w:webHidden/>
+              </w:rPr>
+              <w:t>10</w:t>
+            </w:r>
+            <w:r>
+              <w:rPr>
+                <w:noProof/>
+                <w:webHidden/>
+              </w:rPr>
+              <w:fldChar w:fldCharType="end"/>
+            </w:r>
+          </w:hyperlink>
+        </w:p>
+        <w:p>
+          <w:pPr>
+            <w:pStyle w:val="Verzeichnis1"/>
+            <w:tabs>
+              <w:tab w:val="left" w:pos="660"/>
+              <w:tab w:val="right" w:leader="dot" w:pos="9062"/>
+            </w:tabs>
+            <w:rPr>
+              <w:rFonts w:asciiTheme="minorHAnsi" w:eastAsiaTheme="minorEastAsia" w:hAnsiTheme="minorHAnsi"/>
+              <w:noProof/>
+              <w:sz w:val="22"/>
+              <w:lang w:eastAsia="de-DE"/>
+            </w:rPr>
+          </w:pPr>
+          <w:hyperlink w:anchor="_Toc77091279" w:history="1">
+            <w:r>
+              <w:rPr>
+                <w:rStyle w:val="Hyperlink"/>
+                <w:noProof/>
+                <w:lang w:val="en-US"/>
+              </w:rPr>
+              <w:t>7.</w:t>
+            </w:r>
+            <w:r>
+              <w:rPr>
+                <w:rFonts w:asciiTheme="minorHAnsi" w:eastAsiaTheme="minorEastAsia" w:hAnsiTheme="minorHAnsi"/>
+                <w:noProof/>
+                <w:sz w:val="22"/>
+                <w:lang w:eastAsia="de-DE"/>
+              </w:rPr>
+              <w:tab/>
+            </w:r>
+            <w:r>
+              <w:rPr>
+                <w:rStyle w:val="Hyperlink"/>
+                <w:noProof/>
+                <w:lang w:val="en-US"/>
+              </w:rPr>
               <w:t>What the UDS can’t do + Known issues</w:t>
             </w:r>
             <w:r>
@@ -1993,7 +2263,7 @@
                 <w:noProof/>
                 <w:webHidden/>
               </w:rPr>
-              <w:instrText xml:space="preserve"> PAGEREF _Toc76918458 \h </w:instrText>
+              <w:instrText xml:space="preserve"> PAGEREF _Toc77091279 \h </w:instrText>
             </w:r>
             <w:r>
               <w:rPr>
@@ -2013,7 +2283,7 @@
                 <w:noProof/>
                 <w:webHidden/>
               </w:rPr>
-              <w:t>10</w:t>
+              <w:t>11</w:t>
             </w:r>
             <w:r>
               <w:rPr>
@@ -2067,7 +2337,7 @@
           <w:lang w:val="en-US"/>
         </w:rPr>
       </w:pPr>
-      <w:bookmarkStart w:id="0" w:name="_Toc76918437"/>
+      <w:bookmarkStart w:id="0" w:name="_Toc77091255"/>
       <w:r>
         <w:rPr>
           <w:lang w:val="en-US"/>
@@ -2110,7 +2380,7 @@
           <w:lang w:val="en-US"/>
         </w:rPr>
       </w:pPr>
-      <w:bookmarkStart w:id="1" w:name="_Toc76918438"/>
+      <w:bookmarkStart w:id="1" w:name="_Toc77091256"/>
       <w:r>
         <w:rPr>
           <w:lang w:val="en-US"/>
@@ -2127,21 +2397,23 @@
           <w:lang w:val="en-US"/>
         </w:rPr>
       </w:pPr>
+      <w:proofErr w:type="gramStart"/>
       <w:r>
         <w:rPr>
           <w:i/>
           <w:iCs/>
           <w:lang w:val="en-US"/>
         </w:rPr>
-        <w:t>First of all, thank you for buying and using the Universal Dialog System for Unity</w:t>
-      </w:r>
+        <w:t>First of all</w:t>
+      </w:r>
+      <w:proofErr w:type="gramEnd"/>
       <w:r>
         <w:rPr>
           <w:i/>
           <w:iCs/>
           <w:lang w:val="en-US"/>
         </w:rPr>
-        <w:t xml:space="preserve"> by Benedikt Wille</w:t>
+        <w:t>, thank you for buying and using the Universal Dialog System for Unity</w:t>
       </w:r>
       <w:r>
         <w:rPr>
@@ -2149,6 +2421,14 @@
           <w:iCs/>
           <w:lang w:val="en-US"/>
         </w:rPr>
+        <w:t xml:space="preserve"> by Benedikt Wille</w:t>
+      </w:r>
+      <w:r>
+        <w:rPr>
+          <w:i/>
+          <w:iCs/>
+          <w:lang w:val="en-US"/>
+        </w:rPr>
         <w:t xml:space="preserve">. </w:t>
       </w:r>
     </w:p>
@@ -2253,13 +2533,21 @@
         <w:rPr>
           <w:lang w:val="en-US"/>
         </w:rPr>
-        <w:t>. To play them ingame you use the</w:t>
-      </w:r>
-      <w:r>
-        <w:rPr>
-          <w:lang w:val="en-US"/>
-        </w:rPr>
-        <w:t xml:space="preserve"> UDSDialogManager</w:t>
+        <w:t xml:space="preserve">. To play them </w:t>
+      </w:r>
+      <w:proofErr w:type="spellStart"/>
+      <w:r>
+        <w:rPr>
+          <w:lang w:val="en-US"/>
+        </w:rPr>
+        <w:t>ingame</w:t>
+      </w:r>
+      <w:proofErr w:type="spellEnd"/>
+      <w:r>
+        <w:rPr>
+          <w:lang w:val="en-US"/>
+        </w:rPr>
+        <w:t xml:space="preserve"> you use the</w:t>
       </w:r>
       <w:r>
         <w:rPr>
@@ -2267,6 +2555,20 @@
         </w:rPr>
         <w:t xml:space="preserve"> </w:t>
       </w:r>
+      <w:proofErr w:type="spellStart"/>
+      <w:r>
+        <w:rPr>
+          <w:lang w:val="en-US"/>
+        </w:rPr>
+        <w:t>UDSDialogManager</w:t>
+      </w:r>
+      <w:proofErr w:type="spellEnd"/>
+      <w:r>
+        <w:rPr>
+          <w:lang w:val="en-US"/>
+        </w:rPr>
+        <w:t xml:space="preserve"> </w:t>
+      </w:r>
       <w:r>
         <w:rPr>
           <w:lang w:val="en-US"/>
@@ -2301,7 +2603,21 @@
         <w:rPr>
           <w:lang w:val="en-US"/>
         </w:rPr>
-        <w:t xml:space="preserve"> care of showing text, answers, etc. in the UI. This includes loading the Dialogs from the Resources folder, playing back text gradually, responding to user input (e.g. answers) on both desktop and touch devices </w:t>
+        <w:t xml:space="preserve"> care of showing text, answers, etc. in the UI. This includes loading the Dialogs from the Resources folder, playing back text gradually, responding to user input (</w:t>
+      </w:r>
+      <w:proofErr w:type="gramStart"/>
+      <w:r>
+        <w:rPr>
+          <w:lang w:val="en-US"/>
+        </w:rPr>
+        <w:t>e.g.</w:t>
+      </w:r>
+      <w:proofErr w:type="gramEnd"/>
+      <w:r>
+        <w:rPr>
+          <w:lang w:val="en-US"/>
+        </w:rPr>
+        <w:t xml:space="preserve"> answers) on both desktop and touch devices </w:t>
       </w:r>
       <w:r>
         <w:rPr>
@@ -2325,7 +2641,35 @@
         <w:rPr>
           <w:lang w:val="en-US"/>
         </w:rPr>
-        <w:t>Unity’s MonoBehaviours and messages (Start, OnTriggerEnter, …) work.</w:t>
+        <w:t xml:space="preserve">Unity’s </w:t>
+      </w:r>
+      <w:proofErr w:type="spellStart"/>
+      <w:r>
+        <w:rPr>
+          <w:lang w:val="en-US"/>
+        </w:rPr>
+        <w:t>MonoBehaviours</w:t>
+      </w:r>
+      <w:proofErr w:type="spellEnd"/>
+      <w:r>
+        <w:rPr>
+          <w:lang w:val="en-US"/>
+        </w:rPr>
+        <w:t xml:space="preserve"> and messages (Start, </w:t>
+      </w:r>
+      <w:proofErr w:type="spellStart"/>
+      <w:r>
+        <w:rPr>
+          <w:lang w:val="en-US"/>
+        </w:rPr>
+        <w:t>OnTriggerEnter</w:t>
+      </w:r>
+      <w:proofErr w:type="spellEnd"/>
+      <w:r>
+        <w:rPr>
+          <w:lang w:val="en-US"/>
+        </w:rPr>
+        <w:t>, …) work.</w:t>
       </w:r>
     </w:p>
     <w:p>
@@ -2426,7 +2770,7 @@
           <w:lang w:val="en-US"/>
         </w:rPr>
       </w:pPr>
-      <w:bookmarkStart w:id="2" w:name="_Toc76918439"/>
+      <w:bookmarkStart w:id="2" w:name="_Toc77091257"/>
       <w:r>
         <w:rPr>
           <w:lang w:val="en-US"/>
@@ -2459,7 +2803,7 @@
           <w:lang w:val="en-US"/>
         </w:rPr>
       </w:pPr>
-      <w:bookmarkStart w:id="3" w:name="_Toc76918440"/>
+      <w:bookmarkStart w:id="3" w:name="_Toc77091258"/>
       <w:r>
         <w:rPr>
           <w:lang w:val="en-US"/>
@@ -2541,14 +2885,36 @@
         <w:rPr>
           <w:lang w:val="en-US"/>
         </w:rPr>
-        <w:t>The Dialogs are being stored as JSON files with the “</w:t>
-      </w:r>
-      <w:r>
-        <w:rPr>
-          <w:lang w:val="en-US"/>
-        </w:rPr>
-        <w:t>.udsdialog.json</w:t>
-      </w:r>
+        <w:t xml:space="preserve">The Dialogs are being stored as JSON files with the </w:t>
+      </w:r>
+      <w:proofErr w:type="gramStart"/>
+      <w:r>
+        <w:rPr>
+          <w:lang w:val="en-US"/>
+        </w:rPr>
+        <w:t>“</w:t>
+      </w:r>
+      <w:r>
+        <w:rPr>
+          <w:lang w:val="en-US"/>
+        </w:rPr>
+        <w:t>.</w:t>
+      </w:r>
+      <w:proofErr w:type="spellStart"/>
+      <w:r>
+        <w:rPr>
+          <w:lang w:val="en-US"/>
+        </w:rPr>
+        <w:t>udsdialog</w:t>
+      </w:r>
+      <w:proofErr w:type="gramEnd"/>
+      <w:r>
+        <w:rPr>
+          <w:lang w:val="en-US"/>
+        </w:rPr>
+        <w:t>.json</w:t>
+      </w:r>
+      <w:proofErr w:type="spellEnd"/>
       <w:r>
         <w:rPr>
           <w:lang w:val="en-US"/>
@@ -2599,7 +2965,35 @@
         <w:rPr>
           <w:lang w:val="en-US"/>
         </w:rPr>
-        <w:t xml:space="preserve"> ingame you use the UDSDialogManager component. </w:t>
+        <w:t xml:space="preserve"> </w:t>
+      </w:r>
+      <w:proofErr w:type="spellStart"/>
+      <w:r>
+        <w:rPr>
+          <w:lang w:val="en-US"/>
+        </w:rPr>
+        <w:t>ingame</w:t>
+      </w:r>
+      <w:proofErr w:type="spellEnd"/>
+      <w:r>
+        <w:rPr>
+          <w:lang w:val="en-US"/>
+        </w:rPr>
+        <w:t xml:space="preserve"> you use the </w:t>
+      </w:r>
+      <w:proofErr w:type="spellStart"/>
+      <w:r>
+        <w:rPr>
+          <w:lang w:val="en-US"/>
+        </w:rPr>
+        <w:t>UDSDialogManager</w:t>
+      </w:r>
+      <w:proofErr w:type="spellEnd"/>
+      <w:r>
+        <w:rPr>
+          <w:lang w:val="en-US"/>
+        </w:rPr>
+        <w:t xml:space="preserve"> component. </w:t>
       </w:r>
       <w:r>
         <w:rPr>
@@ -2623,7 +3017,21 @@
         <w:rPr>
           <w:lang w:val="en-US"/>
         </w:rPr>
-        <w:t>playing back text gradually, responding to user input (e.g. answers) on both desktop and touch devices and providing loads of interfaces for your code to work with.</w:t>
+        <w:t>playing back text gradually, responding to user input (</w:t>
+      </w:r>
+      <w:proofErr w:type="gramStart"/>
+      <w:r>
+        <w:rPr>
+          <w:lang w:val="en-US"/>
+        </w:rPr>
+        <w:t>e.g.</w:t>
+      </w:r>
+      <w:proofErr w:type="gramEnd"/>
+      <w:r>
+        <w:rPr>
+          <w:lang w:val="en-US"/>
+        </w:rPr>
+        <w:t xml:space="preserve"> answers) on both desktop and touch devices and providing loads of interfaces for your code to work with.</w:t>
       </w:r>
     </w:p>
     <w:p>
@@ -2681,23 +3089,69 @@
           <w:bCs/>
           <w:lang w:val="en-US"/>
         </w:rPr>
-        <w:t xml:space="preserve"> with your own code by overriding methods similar to how Unity’s </w:t>
-      </w:r>
+        <w:t xml:space="preserve"> with your own code by overriding methods </w:t>
+      </w:r>
+      <w:proofErr w:type="gramStart"/>
       <w:r>
         <w:rPr>
           <w:b/>
           <w:bCs/>
           <w:lang w:val="en-US"/>
         </w:rPr>
-        <w:t xml:space="preserve">MonoBehaviours and </w:t>
-      </w:r>
+        <w:t>similar to</w:t>
+      </w:r>
+      <w:proofErr w:type="gramEnd"/>
       <w:r>
         <w:rPr>
           <w:b/>
           <w:bCs/>
           <w:lang w:val="en-US"/>
         </w:rPr>
-        <w:t>messages (Start, OnTriggerEnter, …) work</w:t>
+        <w:t xml:space="preserve"> how Unity’s </w:t>
+      </w:r>
+      <w:proofErr w:type="spellStart"/>
+      <w:r>
+        <w:rPr>
+          <w:b/>
+          <w:bCs/>
+          <w:lang w:val="en-US"/>
+        </w:rPr>
+        <w:t>MonoBehaviours</w:t>
+      </w:r>
+      <w:proofErr w:type="spellEnd"/>
+      <w:r>
+        <w:rPr>
+          <w:b/>
+          <w:bCs/>
+          <w:lang w:val="en-US"/>
+        </w:rPr>
+        <w:t xml:space="preserve"> and </w:t>
+      </w:r>
+      <w:r>
+        <w:rPr>
+          <w:b/>
+          <w:bCs/>
+          <w:lang w:val="en-US"/>
+        </w:rPr>
+        <w:t xml:space="preserve">messages (Start, </w:t>
+      </w:r>
+      <w:proofErr w:type="spellStart"/>
+      <w:r>
+        <w:rPr>
+          <w:b/>
+          <w:bCs/>
+          <w:lang w:val="en-US"/>
+        </w:rPr>
+        <w:t>OnTriggerEnter</w:t>
+      </w:r>
+      <w:proofErr w:type="spellEnd"/>
+      <w:r>
+        <w:rPr>
+          <w:b/>
+          <w:bCs/>
+          <w:lang w:val="en-US"/>
+        </w:rPr>
+        <w:t>, …) work</w:t>
       </w:r>
       <w:r>
         <w:rPr>
@@ -2737,7 +3191,29 @@
           <w:szCs w:val="20"/>
           <w:lang w:val="en-US"/>
         </w:rPr>
-        <w:t xml:space="preserve">Note: You don’t </w:t>
+        <w:t xml:space="preserve">Note: You </w:t>
+      </w:r>
+      <w:proofErr w:type="gramStart"/>
+      <w:r>
+        <w:rPr>
+          <w:i/>
+          <w:iCs/>
+          <w:sz w:val="24"/>
+          <w:szCs w:val="20"/>
+          <w:lang w:val="en-US"/>
+        </w:rPr>
+        <w:t>don’t</w:t>
+      </w:r>
+      <w:proofErr w:type="gramEnd"/>
+      <w:r>
+        <w:rPr>
+          <w:i/>
+          <w:iCs/>
+          <w:sz w:val="24"/>
+          <w:szCs w:val="20"/>
+          <w:lang w:val="en-US"/>
+        </w:rPr>
+        <w:t xml:space="preserve"> </w:t>
       </w:r>
       <w:r>
         <w:rPr>
@@ -2889,7 +3365,7 @@
           <w:lang w:val="en-US"/>
         </w:rPr>
       </w:pPr>
-      <w:bookmarkStart w:id="4" w:name="_Toc76918441"/>
+      <w:bookmarkStart w:id="4" w:name="_Toc77091259"/>
       <w:r>
         <w:rPr>
           <w:lang w:val="en-US"/>
@@ -2909,7 +3385,21 @@
         <w:rPr>
           <w:lang w:val="en-US"/>
         </w:rPr>
-        <w:t xml:space="preserve">Every Dialog consists of Dialog Parts. A Dialog Part is one node in the Dialog graph. It’s most important feature is its text, which is just the text said by the Dialog partner at that node </w:t>
+        <w:t xml:space="preserve">Every Dialog consists of Dialog Parts. A Dialog Part is one node in the Dialog graph. </w:t>
+      </w:r>
+      <w:proofErr w:type="gramStart"/>
+      <w:r>
+        <w:rPr>
+          <w:lang w:val="en-US"/>
+        </w:rPr>
+        <w:t>It’s</w:t>
+      </w:r>
+      <w:proofErr w:type="gramEnd"/>
+      <w:r>
+        <w:rPr>
+          <w:lang w:val="en-US"/>
+        </w:rPr>
+        <w:t xml:space="preserve"> most important feature is its text, which is just the text said by the Dialog partner at that node </w:t>
       </w:r>
       <w:r>
         <w:rPr>
@@ -2935,13 +3425,49 @@
           <w:szCs w:val="20"/>
           <w:lang w:val="en-US"/>
         </w:rPr>
-        <w:t>(e.g. “Yes”, “No”, “Goodbye”, …)</w:t>
-      </w:r>
-      <w:r>
-        <w:rPr>
-          <w:lang w:val="en-US"/>
-        </w:rPr>
-        <w:t>. The Answers serve as the edges of the Dialog graph by connecting the Dialog Parts. However, Dialog Parts can also be connected together directly, if the Part with the outgoing edge does not have any answers. Dialogs, Dialog Parts and Answers are all called Dialog Components.</w:t>
+        <w:t>(</w:t>
+      </w:r>
+      <w:proofErr w:type="gramStart"/>
+      <w:r>
+        <w:rPr>
+          <w:i/>
+          <w:iCs/>
+          <w:sz w:val="24"/>
+          <w:szCs w:val="20"/>
+          <w:lang w:val="en-US"/>
+        </w:rPr>
+        <w:t>e.g.</w:t>
+      </w:r>
+      <w:proofErr w:type="gramEnd"/>
+      <w:r>
+        <w:rPr>
+          <w:i/>
+          <w:iCs/>
+          <w:sz w:val="24"/>
+          <w:szCs w:val="20"/>
+          <w:lang w:val="en-US"/>
+        </w:rPr>
+        <w:t xml:space="preserve"> “Yes”, “No”, “Goodbye”, …)</w:t>
+      </w:r>
+      <w:r>
+        <w:rPr>
+          <w:lang w:val="en-US"/>
+        </w:rPr>
+        <w:t xml:space="preserve">. The Answers serve as the edges of the Dialog graph by connecting the Dialog Parts. However, Dialog Parts can also be </w:t>
+      </w:r>
+      <w:proofErr w:type="gramStart"/>
+      <w:r>
+        <w:rPr>
+          <w:lang w:val="en-US"/>
+        </w:rPr>
+        <w:t>connected together</w:t>
+      </w:r>
+      <w:proofErr w:type="gramEnd"/>
+      <w:r>
+        <w:rPr>
+          <w:lang w:val="en-US"/>
+        </w:rPr>
+        <w:t xml:space="preserve"> directly, if the Part with the outgoing edge does not have any answers. Dialogs, Dialog Parts and Answers are all called Dialog Components.</w:t>
       </w:r>
     </w:p>
     <w:p>
@@ -2955,7 +3481,7 @@
           <w:lang w:val="en-US"/>
         </w:rPr>
       </w:pPr>
-      <w:bookmarkStart w:id="5" w:name="_Toc76918442"/>
+      <w:bookmarkStart w:id="5" w:name="_Toc77091260"/>
       <w:r>
         <w:rPr>
           <w:lang w:val="en-US"/>
@@ -2982,8 +3508,9 @@
           <w:szCs w:val="20"/>
           <w:lang w:val="en-US"/>
         </w:rPr>
-        <w:t>Note: You don’t need to use Properties in your game. The Dialog System works fine with just the required ones. However, they are your way to add your own logic to a Dialog</w:t>
-      </w:r>
+        <w:t xml:space="preserve">Note: You </w:t>
+      </w:r>
+      <w:proofErr w:type="gramStart"/>
       <w:r>
         <w:rPr>
           <w:i/>
@@ -2992,39 +3519,60 @@
           <w:szCs w:val="20"/>
           <w:lang w:val="en-US"/>
         </w:rPr>
-        <w:t>.</w:t>
-      </w:r>
-    </w:p>
-    <w:p>
-      <w:pPr>
-        <w:rPr>
-          <w:lang w:val="en-US"/>
-        </w:rPr>
-      </w:pPr>
-      <w:r>
-        <w:rPr>
-          <w:lang w:val="en-US"/>
-        </w:rPr>
-        <w:t xml:space="preserve">Properties are like variables in C# and can be of type </w:t>
-      </w:r>
+        <w:t>don’t</w:t>
+      </w:r>
+      <w:proofErr w:type="gramEnd"/>
       <w:r>
         <w:rPr>
           <w:i/>
           <w:iCs/>
-          <w:lang w:val="en-US"/>
-        </w:rPr>
-        <w:t xml:space="preserve">string, int, bool </w:t>
-      </w:r>
-      <w:r>
-        <w:rPr>
-          <w:lang w:val="en-US"/>
-        </w:rPr>
-        <w:t xml:space="preserve">or </w:t>
+          <w:sz w:val="24"/>
+          <w:szCs w:val="20"/>
+          <w:lang w:val="en-US"/>
+        </w:rPr>
+        <w:t xml:space="preserve"> need to use Properties in your game. The Dialog System works fine with just the required ones. However, they are your way to add your own logic to a Dialog</w:t>
       </w:r>
       <w:r>
         <w:rPr>
           <w:i/>
           <w:iCs/>
+          <w:sz w:val="24"/>
+          <w:szCs w:val="20"/>
+          <w:lang w:val="en-US"/>
+        </w:rPr>
+        <w:t>.</w:t>
+      </w:r>
+    </w:p>
+    <w:p>
+      <w:pPr>
+        <w:rPr>
+          <w:lang w:val="en-US"/>
+        </w:rPr>
+      </w:pPr>
+      <w:r>
+        <w:rPr>
+          <w:lang w:val="en-US"/>
+        </w:rPr>
+        <w:t xml:space="preserve">Properties are like variables in C# and can be of type </w:t>
+      </w:r>
+      <w:r>
+        <w:rPr>
+          <w:i/>
+          <w:iCs/>
+          <w:lang w:val="en-US"/>
+        </w:rPr>
+        <w:t xml:space="preserve">string, int, bool </w:t>
+      </w:r>
+      <w:r>
+        <w:rPr>
+          <w:lang w:val="en-US"/>
+        </w:rPr>
+        <w:t xml:space="preserve">or </w:t>
+      </w:r>
+      <w:r>
+        <w:rPr>
+          <w:i/>
+          <w:iCs/>
           <w:lang w:val="en-US"/>
         </w:rPr>
         <w:t>float</w:t>
@@ -3066,7 +3614,14 @@
         <w:rPr>
           <w:lang w:val="en-US"/>
         </w:rPr>
-        <w:t xml:space="preserve"> a</w:t>
+        <w:t xml:space="preserve"> </w:t>
+      </w:r>
+      <w:proofErr w:type="gramStart"/>
+      <w:r>
+        <w:rPr>
+          <w:lang w:val="en-US"/>
+        </w:rPr>
+        <w:t>a</w:t>
       </w:r>
       <w:r>
         <w:rPr>
@@ -3074,6 +3629,7 @@
         </w:rPr>
         <w:t>n</w:t>
       </w:r>
+      <w:proofErr w:type="gramEnd"/>
       <w:r>
         <w:rPr>
           <w:lang w:val="en-US"/>
@@ -3143,7 +3699,21 @@
         <w:rPr>
           <w:lang w:val="en-US"/>
         </w:rPr>
-        <w:t>Properties using the Dialog Editor and then access them in your game code inside a method overridden from the UDSDialogManager (see 4)</w:t>
+        <w:t xml:space="preserve">Properties using the Dialog Editor and then access them in your game code inside a method overridden from the </w:t>
+      </w:r>
+      <w:proofErr w:type="spellStart"/>
+      <w:r>
+        <w:rPr>
+          <w:lang w:val="en-US"/>
+        </w:rPr>
+        <w:t>UDSDialogManager</w:t>
+      </w:r>
+      <w:proofErr w:type="spellEnd"/>
+      <w:r>
+        <w:rPr>
+          <w:lang w:val="en-US"/>
+        </w:rPr>
+        <w:t xml:space="preserve"> (see 4)</w:t>
       </w:r>
       <w:r>
         <w:rPr>
@@ -3170,7 +3740,7 @@
           <w:lang w:val="en-US"/>
         </w:rPr>
       </w:pPr>
-      <w:bookmarkStart w:id="6" w:name="_Toc76918443"/>
+      <w:bookmarkStart w:id="6" w:name="_Toc77091261"/>
       <w:r>
         <w:rPr>
           <w:lang w:val="en-US"/>
@@ -3211,32 +3781,9 @@
           <w:szCs w:val="20"/>
           <w:lang w:val="en-US"/>
         </w:rPr>
-        <w:t>(e.g. player has reached a certain level or done a certain quest)</w:t>
-      </w:r>
-      <w:r>
-        <w:rPr>
-          <w:lang w:val="en-US"/>
-        </w:rPr>
-        <w:t xml:space="preserve">. </w:t>
-      </w:r>
-      <w:r>
-        <w:rPr>
-          <w:lang w:val="en-US"/>
-        </w:rPr>
-        <w:t xml:space="preserve">This allows you to influence the Dialogs dynamically at runtime. </w:t>
-      </w:r>
-      <w:r>
-        <w:rPr>
-          <w:lang w:val="en-US"/>
-        </w:rPr>
-        <w:t>Conditions</w:t>
-      </w:r>
-      <w:r>
-        <w:rPr>
-          <w:lang w:val="en-US"/>
-        </w:rPr>
-        <w:t xml:space="preserve"> can be set in the editor and are based on the Global Properties, which work just like normal Properties, but are unique and accessible from everywhere in the project. </w:t>
-      </w:r>
+        <w:t>(</w:t>
+      </w:r>
+      <w:proofErr w:type="gramStart"/>
       <w:r>
         <w:rPr>
           <w:i/>
@@ -3245,7 +3792,74 @@
           <w:szCs w:val="20"/>
           <w:lang w:val="en-US"/>
         </w:rPr>
-        <w:t>(they can be compared to static variables in C#)</w:t>
+        <w:t>e.g.</w:t>
+      </w:r>
+      <w:proofErr w:type="gramEnd"/>
+      <w:r>
+        <w:rPr>
+          <w:i/>
+          <w:iCs/>
+          <w:sz w:val="24"/>
+          <w:szCs w:val="20"/>
+          <w:lang w:val="en-US"/>
+        </w:rPr>
+        <w:t xml:space="preserve"> player has reached a certain level or done a certain quest)</w:t>
+      </w:r>
+      <w:r>
+        <w:rPr>
+          <w:lang w:val="en-US"/>
+        </w:rPr>
+        <w:t xml:space="preserve">. </w:t>
+      </w:r>
+      <w:r>
+        <w:rPr>
+          <w:lang w:val="en-US"/>
+        </w:rPr>
+        <w:t xml:space="preserve">This allows you to influence the Dialogs dynamically at runtime. </w:t>
+      </w:r>
+      <w:r>
+        <w:rPr>
+          <w:lang w:val="en-US"/>
+        </w:rPr>
+        <w:t>Conditions</w:t>
+      </w:r>
+      <w:r>
+        <w:rPr>
+          <w:lang w:val="en-US"/>
+        </w:rPr>
+        <w:t xml:space="preserve"> can be set in the editor and are based on the Global Properties, which work just like normal Properties, but are unique and accessible from everywhere in the project. </w:t>
+      </w:r>
+      <w:r>
+        <w:rPr>
+          <w:i/>
+          <w:iCs/>
+          <w:sz w:val="24"/>
+          <w:szCs w:val="20"/>
+          <w:lang w:val="en-US"/>
+        </w:rPr>
+        <w:t>(</w:t>
+      </w:r>
+      <w:proofErr w:type="gramStart"/>
+      <w:r>
+        <w:rPr>
+          <w:i/>
+          <w:iCs/>
+          <w:sz w:val="24"/>
+          <w:szCs w:val="20"/>
+          <w:lang w:val="en-US"/>
+        </w:rPr>
+        <w:t>they</w:t>
+      </w:r>
+      <w:proofErr w:type="gramEnd"/>
+      <w:r>
+        <w:rPr>
+          <w:i/>
+          <w:iCs/>
+          <w:sz w:val="24"/>
+          <w:szCs w:val="20"/>
+          <w:lang w:val="en-US"/>
+        </w:rPr>
+        <w:t xml:space="preserve"> can be compared to static variables in C#)</w:t>
       </w:r>
       <w:r>
         <w:rPr>
@@ -3362,7 +3976,7 @@
           <w:lang w:val="en-US"/>
         </w:rPr>
       </w:pPr>
-      <w:bookmarkStart w:id="7" w:name="_Toc76918444"/>
+      <w:bookmarkStart w:id="7" w:name="_Toc77091262"/>
       <w:r>
         <w:rPr>
           <w:lang w:val="en-US"/>
@@ -3374,9 +3988,17 @@
         <w:rPr>
           <w:lang w:val="en-US"/>
         </w:rPr>
-        <w:t xml:space="preserve"> + How to run the editor</w:t>
+        <w:t xml:space="preserve"> + How to run the </w:t>
+      </w:r>
+      <w:proofErr w:type="gramStart"/>
+      <w:r>
+        <w:rPr>
+          <w:lang w:val="en-US"/>
+        </w:rPr>
+        <w:t>editor</w:t>
       </w:r>
       <w:bookmarkEnd w:id="7"/>
+      <w:proofErr w:type="gramEnd"/>
     </w:p>
     <w:p>
       <w:pPr>
@@ -3431,7 +4053,25 @@
           <w:bCs/>
           <w:lang w:val="en-US"/>
         </w:rPr>
-        <w:t>Note that the asset “JSON .NET For Unity” is a requirement for the UDS.</w:t>
+        <w:t xml:space="preserve">Note that the asset “JSON .NET </w:t>
+      </w:r>
+      <w:proofErr w:type="gramStart"/>
+      <w:r>
+        <w:rPr>
+          <w:b/>
+          <w:bCs/>
+          <w:lang w:val="en-US"/>
+        </w:rPr>
+        <w:t>For</w:t>
+      </w:r>
+      <w:proofErr w:type="gramEnd"/>
+      <w:r>
+        <w:rPr>
+          <w:b/>
+          <w:bCs/>
+          <w:lang w:val="en-US"/>
+        </w:rPr>
+        <w:t xml:space="preserve"> Unity” is a requirement for the UDS.</w:t>
       </w:r>
       <w:r>
         <w:rPr>
@@ -3473,7 +4113,21 @@
         <w:rPr>
           <w:lang w:val="en-US"/>
         </w:rPr>
-        <w:t xml:space="preserve">The most important components in the package are the UDSDialogManager script and the Dialog Editor. </w:t>
+        <w:t xml:space="preserve">The most important components in the package are the </w:t>
+      </w:r>
+      <w:proofErr w:type="spellStart"/>
+      <w:r>
+        <w:rPr>
+          <w:lang w:val="en-US"/>
+        </w:rPr>
+        <w:t>UDSDialogManager</w:t>
+      </w:r>
+      <w:proofErr w:type="spellEnd"/>
+      <w:r>
+        <w:rPr>
+          <w:lang w:val="en-US"/>
+        </w:rPr>
+        <w:t xml:space="preserve"> script and the Dialog Editor. </w:t>
       </w:r>
       <w:r>
         <w:rPr>
@@ -3554,7 +4208,21 @@
         <w:rPr>
           <w:lang w:val="en-US"/>
         </w:rPr>
-        <w:t xml:space="preserve">The package also includes an example project with several example scripts. These are described in more depth under “3. Quick Start”. To get started with the UDS you should take a look at the </w:t>
+        <w:t xml:space="preserve">The package also includes an example project with several example scripts. These are described in more depth under “3. Quick Start”. To get started with the UDS you should </w:t>
+      </w:r>
+      <w:proofErr w:type="gramStart"/>
+      <w:r>
+        <w:rPr>
+          <w:lang w:val="en-US"/>
+        </w:rPr>
+        <w:t>take a look</w:t>
+      </w:r>
+      <w:proofErr w:type="gramEnd"/>
+      <w:r>
+        <w:rPr>
+          <w:lang w:val="en-US"/>
+        </w:rPr>
+        <w:t xml:space="preserve"> at the </w:t>
       </w:r>
       <w:r>
         <w:rPr>
@@ -3570,6 +4238,7 @@
         </w:rPr>
         <w:t xml:space="preserve"> and </w:t>
       </w:r>
+      <w:proofErr w:type="spellStart"/>
       <w:r>
         <w:rPr>
           <w:i/>
@@ -3578,6 +4247,7 @@
         </w:rPr>
         <w:t>UDSPlayerDialog</w:t>
       </w:r>
+      <w:proofErr w:type="spellEnd"/>
       <w:r>
         <w:rPr>
           <w:lang w:val="en-US"/>
@@ -3602,14 +4272,32 @@
           <w:bCs/>
           <w:lang w:val="en-US"/>
         </w:rPr>
-        <w:t>However, these are only example scripts and I encourage you to look into them and extend them as needed.</w:t>
-      </w:r>
+        <w:t xml:space="preserve">However, these are only example scripts and I encourage you to </w:t>
+      </w:r>
+      <w:proofErr w:type="gramStart"/>
       <w:r>
         <w:rPr>
           <w:b/>
           <w:bCs/>
           <w:lang w:val="en-US"/>
         </w:rPr>
+        <w:t>look into</w:t>
+      </w:r>
+      <w:proofErr w:type="gramEnd"/>
+      <w:r>
+        <w:rPr>
+          <w:b/>
+          <w:bCs/>
+          <w:lang w:val="en-US"/>
+        </w:rPr>
+        <w:t xml:space="preserve"> them and extend them as needed.</w:t>
+      </w:r>
+      <w:r>
+        <w:rPr>
+          <w:b/>
+          <w:bCs/>
+          <w:lang w:val="en-US"/>
+        </w:rPr>
         <w:t xml:space="preserve"> </w:t>
       </w:r>
       <w:r>
@@ -3618,13 +4306,23 @@
         </w:rPr>
         <w:t xml:space="preserve">Just like the </w:t>
       </w:r>
+      <w:proofErr w:type="spellStart"/>
       <w:r>
         <w:rPr>
           <w:i/>
           <w:iCs/>
           <w:lang w:val="en-US"/>
         </w:rPr>
-        <w:t xml:space="preserve">UDSDialogManager </w:t>
+        <w:t>UDSDialogManager</w:t>
+      </w:r>
+      <w:proofErr w:type="spellEnd"/>
+      <w:r>
+        <w:rPr>
+          <w:i/>
+          <w:iCs/>
+          <w:lang w:val="en-US"/>
+        </w:rPr>
+        <w:t xml:space="preserve"> </w:t>
       </w:r>
       <w:r>
         <w:rPr>
@@ -3652,7 +4350,7 @@
           <w:lang w:val="en-US"/>
         </w:rPr>
       </w:pPr>
-      <w:bookmarkStart w:id="8" w:name="_Toc76918445"/>
+      <w:bookmarkStart w:id="8" w:name="_Toc77091263"/>
       <w:r>
         <w:rPr>
           <w:lang w:val="en-US"/>
@@ -3670,9 +4368,17 @@
         <w:rPr>
           <w:lang w:val="en-US"/>
         </w:rPr>
-        <w:t xml:space="preserve"> and making a Dialog</w:t>
+        <w:t xml:space="preserve"> and making a </w:t>
+      </w:r>
+      <w:proofErr w:type="gramStart"/>
+      <w:r>
+        <w:rPr>
+          <w:lang w:val="en-US"/>
+        </w:rPr>
+        <w:t>Dialog</w:t>
       </w:r>
       <w:bookmarkEnd w:id="8"/>
+      <w:proofErr w:type="gramEnd"/>
     </w:p>
     <w:p>
       <w:pPr>
@@ -3698,7 +4404,7 @@
           <w:lang w:val="en-US"/>
         </w:rPr>
       </w:pPr>
-      <w:bookmarkStart w:id="9" w:name="_Toc76918446"/>
+      <w:bookmarkStart w:id="9" w:name="_Toc77091264"/>
       <w:r>
         <w:rPr>
           <w:lang w:val="en-US"/>
@@ -3722,7 +4428,21 @@
         <w:rPr>
           <w:lang w:val="en-US"/>
         </w:rPr>
-        <w:t xml:space="preserve">and UDSDialogManager </w:t>
+        <w:t xml:space="preserve">and </w:t>
+      </w:r>
+      <w:proofErr w:type="spellStart"/>
+      <w:r>
+        <w:rPr>
+          <w:lang w:val="en-US"/>
+        </w:rPr>
+        <w:t>UDSDialogManager</w:t>
+      </w:r>
+      <w:proofErr w:type="spellEnd"/>
+      <w:r>
+        <w:rPr>
+          <w:lang w:val="en-US"/>
+        </w:rPr>
+        <w:t xml:space="preserve"> </w:t>
       </w:r>
       <w:r>
         <w:rPr>
@@ -3743,7 +4463,7 @@
           <w:lang w:val="en-US"/>
         </w:rPr>
       </w:pPr>
-      <w:bookmarkStart w:id="10" w:name="_Toc76918447"/>
+      <w:bookmarkStart w:id="10" w:name="_Toc77091265"/>
       <w:r>
         <w:rPr>
           <w:lang w:val="en-US"/>
@@ -3763,7 +4483,7 @@
           <w:lang w:val="en-US"/>
         </w:rPr>
       </w:pPr>
-      <w:bookmarkStart w:id="11" w:name="_Toc76918448"/>
+      <w:bookmarkStart w:id="11" w:name="_Toc77091266"/>
       <w:r>
         <w:rPr>
           <w:lang w:val="en-US"/>
@@ -3783,7 +4503,7 @@
           <w:lang w:val="en-US"/>
         </w:rPr>
       </w:pPr>
-      <w:bookmarkStart w:id="12" w:name="_Toc76918449"/>
+      <w:bookmarkStart w:id="12" w:name="_Toc77091267"/>
       <w:r>
         <w:rPr>
           <w:lang w:val="en-US"/>
@@ -3803,7 +4523,7 @@
           <w:lang w:val="en-US"/>
         </w:rPr>
       </w:pPr>
-      <w:bookmarkStart w:id="13" w:name="_Toc76918450"/>
+      <w:bookmarkStart w:id="13" w:name="_Toc77091268"/>
       <w:r>
         <w:rPr>
           <w:lang w:val="en-US"/>
@@ -3820,9 +4540,17 @@
         <w:rPr>
           <w:lang w:val="en-US"/>
         </w:rPr>
-        <w:t xml:space="preserve"> own functionality</w:t>
+        <w:t xml:space="preserve"> own </w:t>
+      </w:r>
+      <w:proofErr w:type="gramStart"/>
+      <w:r>
+        <w:rPr>
+          <w:lang w:val="en-US"/>
+        </w:rPr>
+        <w:t>functionality</w:t>
       </w:r>
       <w:bookmarkEnd w:id="13"/>
+      <w:proofErr w:type="gramEnd"/>
     </w:p>
     <w:p>
       <w:pPr>
@@ -3835,14 +4563,22 @@
           <w:lang w:val="en-US"/>
         </w:rPr>
       </w:pPr>
-      <w:bookmarkStart w:id="14" w:name="_Toc76918451"/>
-      <w:r>
-        <w:rPr>
-          <w:lang w:val="en-US"/>
-        </w:rPr>
-        <w:t>Dialog Components and working with Properties</w:t>
+      <w:bookmarkStart w:id="14" w:name="_Toc77091269"/>
+      <w:r>
+        <w:rPr>
+          <w:lang w:val="en-US"/>
+        </w:rPr>
+        <w:t xml:space="preserve">Dialog Components and working with </w:t>
+      </w:r>
+      <w:proofErr w:type="gramStart"/>
+      <w:r>
+        <w:rPr>
+          <w:lang w:val="en-US"/>
+        </w:rPr>
+        <w:t>Properties</w:t>
       </w:r>
       <w:bookmarkEnd w:id="14"/>
+      <w:proofErr w:type="gramEnd"/>
     </w:p>
     <w:p>
       <w:pPr>
@@ -3855,7 +4591,7 @@
           <w:lang w:val="en-US"/>
         </w:rPr>
       </w:pPr>
-      <w:bookmarkStart w:id="15" w:name="_Toc76918452"/>
+      <w:bookmarkStart w:id="15" w:name="_Toc77091270"/>
       <w:r>
         <w:rPr>
           <w:lang w:val="en-US"/>
@@ -3866,7 +4602,21 @@
         <w:rPr>
           <w:lang w:val="en-US"/>
         </w:rPr>
-        <w:t>ocumentation for the UDSDialogManager class</w:t>
+        <w:t xml:space="preserve">ocumentation for the </w:t>
+      </w:r>
+      <w:proofErr w:type="spellStart"/>
+      <w:r>
+        <w:rPr>
+          <w:lang w:val="en-US"/>
+        </w:rPr>
+        <w:t>UDSDialogManager</w:t>
+      </w:r>
+      <w:proofErr w:type="spellEnd"/>
+      <w:r>
+        <w:rPr>
+          <w:lang w:val="en-US"/>
+        </w:rPr>
+        <w:t xml:space="preserve"> class</w:t>
       </w:r>
       <w:bookmarkEnd w:id="15"/>
     </w:p>
@@ -3894,7 +4644,7 @@
           <w:lang w:val="en-US"/>
         </w:rPr>
       </w:pPr>
-      <w:bookmarkStart w:id="16" w:name="_Toc76918453"/>
+      <w:bookmarkStart w:id="16" w:name="_Toc77091271"/>
       <w:r>
         <w:rPr>
           <w:lang w:val="en-US"/>
@@ -3915,12 +4665,26 @@
           <w:lang w:val="en-US"/>
         </w:rPr>
       </w:pPr>
-      <w:bookmarkStart w:id="17" w:name="_Toc76918454"/>
-      <w:r>
-        <w:rPr>
-          <w:lang w:val="en-US"/>
-        </w:rPr>
-        <w:t>Creating, saving and loading Dialogs</w:t>
+      <w:bookmarkStart w:id="17" w:name="_Toc77091272"/>
+      <w:r>
+        <w:rPr>
+          <w:lang w:val="en-US"/>
+        </w:rPr>
+        <w:t xml:space="preserve">Creating, </w:t>
+      </w:r>
+      <w:proofErr w:type="gramStart"/>
+      <w:r>
+        <w:rPr>
+          <w:lang w:val="en-US"/>
+        </w:rPr>
+        <w:t>saving</w:t>
+      </w:r>
+      <w:proofErr w:type="gramEnd"/>
+      <w:r>
+        <w:rPr>
+          <w:lang w:val="en-US"/>
+        </w:rPr>
+        <w:t xml:space="preserve"> and loading Dialogs</w:t>
       </w:r>
       <w:bookmarkEnd w:id="17"/>
     </w:p>
@@ -3935,7 +4699,7 @@
           <w:lang w:val="en-US"/>
         </w:rPr>
       </w:pPr>
-      <w:bookmarkStart w:id="18" w:name="_Toc76918455"/>
+      <w:bookmarkStart w:id="18" w:name="_Toc77091273"/>
       <w:r>
         <w:rPr>
           <w:lang w:val="en-US"/>
@@ -3955,7 +4719,7 @@
           <w:lang w:val="en-US"/>
         </w:rPr>
       </w:pPr>
-      <w:bookmarkStart w:id="19" w:name="_Toc76918456"/>
+      <w:bookmarkStart w:id="19" w:name="_Toc77091274"/>
       <w:r>
         <w:rPr>
           <w:lang w:val="en-US"/>
@@ -3975,7 +4739,7 @@
           <w:lang w:val="en-US"/>
         </w:rPr>
       </w:pPr>
-      <w:bookmarkStart w:id="20" w:name="_Toc76918457"/>
+      <w:bookmarkStart w:id="20" w:name="_Toc77091275"/>
       <w:r>
         <w:rPr>
           <w:lang w:val="en-US"/>
@@ -3989,13 +4753,6 @@
         <w:t xml:space="preserve"> and Global Properties</w:t>
       </w:r>
       <w:bookmarkEnd w:id="20"/>
-    </w:p>
-    <w:p>
-      <w:pPr>
-        <w:rPr>
-          <w:lang w:val="en-US"/>
-        </w:rPr>
-      </w:pPr>
     </w:p>
     <w:p>
       <w:pPr>
@@ -4021,15 +4778,102 @@
           <w:lang w:val="en-US"/>
         </w:rPr>
       </w:pPr>
-      <w:bookmarkStart w:id="21" w:name="_Toc76918458"/>
+      <w:bookmarkStart w:id="21" w:name="_Toc77091276"/>
       <w:r>
         <w:rPr>
           <w:lang w:val="en-US"/>
         </w:rPr>
         <w:lastRenderedPageBreak/>
-        <w:t>What the UDS can’t do + Known issues</w:t>
+        <w:t>Examples</w:t>
       </w:r>
       <w:bookmarkEnd w:id="21"/>
+    </w:p>
+    <w:p>
+      <w:pPr>
+        <w:pStyle w:val="berschrift2"/>
+        <w:numPr>
+          <w:ilvl w:val="1"/>
+          <w:numId w:val="1"/>
+        </w:numPr>
+        <w:rPr>
+          <w:lang w:val="en-US"/>
+        </w:rPr>
+      </w:pPr>
+      <w:bookmarkStart w:id="22" w:name="_Toc77091277"/>
+      <w:r>
+        <w:rPr>
+          <w:lang w:val="en-US"/>
+        </w:rPr>
+        <w:t>Opening a shop during a Dialog</w:t>
+      </w:r>
+      <w:bookmarkEnd w:id="22"/>
+    </w:p>
+    <w:p>
+      <w:pPr>
+        <w:pStyle w:val="berschrift2"/>
+        <w:numPr>
+          <w:ilvl w:val="1"/>
+          <w:numId w:val="1"/>
+        </w:numPr>
+        <w:rPr>
+          <w:lang w:val="en-US"/>
+        </w:rPr>
+      </w:pPr>
+      <w:bookmarkStart w:id="23" w:name="_Toc77091278"/>
+      <w:r>
+        <w:rPr>
+          <w:lang w:val="en-US"/>
+        </w:rPr>
+        <w:t xml:space="preserve">Showing to the player </w:t>
+      </w:r>
+      <w:r>
+        <w:rPr>
+          <w:lang w:val="en-US"/>
+        </w:rPr>
+        <w:t>what an Answer does</w:t>
+      </w:r>
+      <w:bookmarkEnd w:id="23"/>
+      <w:r>
+        <w:rPr>
+          <w:lang w:val="en-US"/>
+        </w:rPr>
+        <w:br w:type="page"/>
+      </w:r>
+    </w:p>
+    <w:p>
+      <w:pPr>
+        <w:pStyle w:val="berschrift1"/>
+        <w:numPr>
+          <w:ilvl w:val="0"/>
+          <w:numId w:val="1"/>
+        </w:numPr>
+        <w:rPr>
+          <w:lang w:val="en-US"/>
+        </w:rPr>
+      </w:pPr>
+      <w:bookmarkStart w:id="24" w:name="_Toc77091279"/>
+      <w:r>
+        <w:rPr>
+          <w:lang w:val="en-US"/>
+        </w:rPr>
+        <w:lastRenderedPageBreak/>
+        <w:t xml:space="preserve">What the UDS </w:t>
+      </w:r>
+      <w:proofErr w:type="gramStart"/>
+      <w:r>
+        <w:rPr>
+          <w:lang w:val="en-US"/>
+        </w:rPr>
+        <w:t>can’t</w:t>
+      </w:r>
+      <w:proofErr w:type="gramEnd"/>
+      <w:r>
+        <w:rPr>
+          <w:lang w:val="en-US"/>
+        </w:rPr>
+        <w:t xml:space="preserve"> do + Known issues</w:t>
+      </w:r>
+      <w:bookmarkEnd w:id="24"/>
     </w:p>
     <w:sectPr>
       <w:headerReference w:type="default" r:id="rId10"/>

</xml_diff>